<commit_message>
conversion de tensorflow vers pytorch pour faciliter l'éxécution sur GPU
</commit_message>
<xml_diff>
--- a/Doc/PE-avancement.docx
+++ b/Doc/PE-avancement.docx
@@ -371,6 +371,9 @@
         <w:jc w:val="center"/>
       </w:pPr>
       <w:r>
+        <w:rPr>
+          <w:noProof/>
+        </w:rPr>
         <w:drawing>
           <wp:inline distT="0" distB="0" distL="0" distR="0" wp14:anchorId="0177A835" wp14:editId="425CCE4E">
             <wp:extent cx="3741915" cy="2139475"/>
@@ -408,7 +411,35 @@
         </w:drawing>
       </w:r>
     </w:p>
-    <w:p/>
+    <w:p>
+      <w:r>
+        <w:t xml:space="preserve">Cuda n’est pas compatible avec </w:t>
+      </w:r>
+      <w:proofErr w:type="spellStart"/>
+      <w:r>
+        <w:t>TensorFlow</w:t>
+      </w:r>
+      <w:proofErr w:type="spellEnd"/>
+      <w:r>
+        <w:t xml:space="preserve"> sur Windows, donc je ne peux pas faire tourner sur le GPU. Je passe tout en </w:t>
+      </w:r>
+      <w:proofErr w:type="spellStart"/>
+      <w:r>
+        <w:t>PyTorch</w:t>
+      </w:r>
+      <w:proofErr w:type="spellEnd"/>
+      <w:r>
+        <w:t xml:space="preserve">. Plus besoin de tout mettre en BGR. </w:t>
+      </w:r>
+      <w:proofErr w:type="spellStart"/>
+      <w:r>
+        <w:t>Parcontre</w:t>
+      </w:r>
+      <w:proofErr w:type="spellEnd"/>
+      <w:r>
+        <w:t xml:space="preserve"> il faut toujours un Tenseur 4D en entrée. </w:t>
+      </w:r>
+    </w:p>
     <w:sectPr>
       <w:pgSz w:w="11906" w:h="16838"/>
       <w:pgMar w:top="1417" w:right="1417" w:bottom="1417" w:left="1417" w:header="708" w:footer="708" w:gutter="0"/>

</xml_diff>

<commit_message>
Modèle le plus performant, avec test unitaire à la fin. Début de web-scrapping
</commit_message>
<xml_diff>
--- a/Doc/PE-avancement.docx
+++ b/Doc/PE-avancement.docx
@@ -22,13 +22,8 @@
         </w:numPr>
       </w:pPr>
       <w:r>
-        <w:t xml:space="preserve">Réaliser le </w:t>
-      </w:r>
-      <w:proofErr w:type="spellStart"/>
-      <w:r>
-        <w:t>dataset</w:t>
-      </w:r>
-      <w:proofErr w:type="spellEnd"/>
+        <w:t>Réaliser le dataset</w:t>
+      </w:r>
     </w:p>
     <w:p>
       <w:pPr>
@@ -43,15 +38,7 @@
         <w:ind w:left="360"/>
       </w:pPr>
       <w:r>
-        <w:t xml:space="preserve">Stanford </w:t>
-      </w:r>
-      <w:proofErr w:type="spellStart"/>
-      <w:r>
-        <w:t>dataset</w:t>
-      </w:r>
-      <w:proofErr w:type="spellEnd"/>
-      <w:r>
-        <w:t xml:space="preserve"> </w:t>
+        <w:t xml:space="preserve">Stanford dataset </w:t>
       </w:r>
       <w:r>
         <w:sym w:font="Wingdings" w:char="F0E0"/>
@@ -65,39 +52,18 @@
         <w:ind w:left="360"/>
       </w:pPr>
       <w:r>
-        <w:t xml:space="preserve">Il existe un </w:t>
-      </w:r>
-      <w:proofErr w:type="spellStart"/>
-      <w:r>
-        <w:t>dataset</w:t>
-      </w:r>
-      <w:proofErr w:type="spellEnd"/>
-      <w:r>
-        <w:t xml:space="preserve"> « préfabriqué » avec 9000 classes. Ces classes ne sont pas étiquetées, elles sont rangées dans des dossiers nommés par la marque, le modèle, et l’année du véhicule. </w:t>
-      </w:r>
-      <w:r>
-        <w:t xml:space="preserve">Pas ce couleur, il va falloir utiliser un autre </w:t>
-      </w:r>
-      <w:proofErr w:type="spellStart"/>
-      <w:r>
-        <w:t>dataset</w:t>
-      </w:r>
-      <w:proofErr w:type="spellEnd"/>
-      <w:r>
-        <w:t xml:space="preserve"> pour entraîner sur la couleur. </w:t>
+        <w:t xml:space="preserve">Il existe un dataset « préfabriqué » avec 9000 classes. Ces classes ne sont pas étiquetées, elles sont rangées dans des dossiers nommés par la marque, le modèle, et l’année du véhicule. </w:t>
+      </w:r>
+      <w:r>
+        <w:t xml:space="preserve">Pas ce couleur, il va falloir utiliser un autre dataset pour entraîner sur la couleur. </w:t>
       </w:r>
     </w:p>
     <w:p>
       <w:pPr>
         <w:ind w:left="360"/>
       </w:pPr>
-      <w:proofErr w:type="spellStart"/>
-      <w:r>
-        <w:t>Dataset</w:t>
-      </w:r>
-      <w:proofErr w:type="spellEnd"/>
-      <w:r>
-        <w:t xml:space="preserve"> de base : </w:t>
+      <w:r>
+        <w:t xml:space="preserve">Dataset de base : </w:t>
       </w:r>
       <w:hyperlink r:id="rId5" w:history="1">
         <w:r>
@@ -113,15 +79,7 @@
         <w:ind w:left="360"/>
       </w:pPr>
       <w:r>
-        <w:t xml:space="preserve">Le problème de ce </w:t>
-      </w:r>
-      <w:proofErr w:type="spellStart"/>
-      <w:r>
-        <w:t>dataset</w:t>
-      </w:r>
-      <w:proofErr w:type="spellEnd"/>
-      <w:r>
-        <w:t>, c’est qu’il existe des sous dossiers par motorisation, ce qui est inutile dans mon projet. Il faut donc le rassembler les voitures par modèles et génération</w:t>
+        <w:t>Le problème de ce dataset, c’est qu’il existe des sous dossiers par motorisation, ce qui est inutile dans mon projet. Il faut donc le rassembler les voitures par modèles et génération</w:t>
       </w:r>
     </w:p>
     <w:p>
@@ -185,15 +143,7 @@
         <w:ind w:left="360"/>
       </w:pPr>
       <w:r>
-        <w:t xml:space="preserve">On utilisera ResNet-50 pour détecter une voiture sur l’image ou non. </w:t>
-      </w:r>
-      <w:proofErr w:type="spellStart"/>
-      <w:r>
-        <w:t>ResNet</w:t>
-      </w:r>
-      <w:proofErr w:type="spellEnd"/>
-      <w:r>
-        <w:t xml:space="preserve"> est une architecture qui utilise des « skip connections ». Cela permet d’avoir des réseaux plus profonds et plus complexes. </w:t>
+        <w:t xml:space="preserve">On utilisera ResNet-50 pour détecter une voiture sur l’image ou non. ResNet est une architecture qui utilise des « skip connections ». Cela permet d’avoir des réseaux plus profonds et plus complexes. </w:t>
       </w:r>
     </w:p>
     <w:p>
@@ -201,28 +151,15 @@
         <w:ind w:left="360"/>
       </w:pPr>
       <w:r>
-        <w:t xml:space="preserve">Pour détecter une voiture, il faut que toutes les images aient la bonne taille pour </w:t>
-      </w:r>
-      <w:proofErr w:type="spellStart"/>
-      <w:r>
-        <w:t>ResNet</w:t>
-      </w:r>
-      <w:proofErr w:type="spellEnd"/>
-      <w:r>
-        <w:t> : 224 * 224. Le problème posé est que le ratio largeur/hauteur des images n’étant pas de 1, on va déformer les voitures -&gt; à voir plus tard. On commence comme ça.</w:t>
+        <w:t>Pour détecter une voiture, il faut que toutes les images aient la bonne taille pour ResNet : 224 * 224. Le problème posé est que le ratio largeur/hauteur des images n’étant pas de 1, on va déformer les voitures -&gt; à voir plus tard. On commence comme ça.</w:t>
       </w:r>
     </w:p>
     <w:p>
       <w:pPr>
         <w:ind w:left="360"/>
       </w:pPr>
-      <w:proofErr w:type="spellStart"/>
-      <w:r>
-        <w:t>ResNet</w:t>
-      </w:r>
-      <w:proofErr w:type="spellEnd"/>
-      <w:r>
-        <w:t xml:space="preserve"> a besoin de tenseur 4D en entrée pour fonctionner.</w:t>
+      <w:r>
+        <w:t>ResNet a besoin de tenseur 4D en entrée pour fonctionner.</w:t>
       </w:r>
     </w:p>
     <w:p>
@@ -255,15 +192,7 @@
         <w:ind w:left="360"/>
       </w:pPr>
       <w:r>
-        <w:t xml:space="preserve">3 choses à savoir sur </w:t>
-      </w:r>
-      <w:proofErr w:type="spellStart"/>
-      <w:r>
-        <w:t>ResNet</w:t>
-      </w:r>
-      <w:proofErr w:type="spellEnd"/>
-      <w:r>
-        <w:t xml:space="preserve"> : </w:t>
+        <w:t xml:space="preserve">3 choses à savoir sur ResNet : </w:t>
       </w:r>
     </w:p>
     <w:p>
@@ -275,15 +204,7 @@
         </w:numPr>
       </w:pPr>
       <w:r>
-        <w:t xml:space="preserve">ResNet-50 traite les couleurs en BGR, et non en RGB. Il faut donc inverser les channels. La fonction </w:t>
-      </w:r>
-      <w:proofErr w:type="spellStart"/>
-      <w:r>
-        <w:t>preprocess_input</w:t>
-      </w:r>
-      <w:proofErr w:type="spellEnd"/>
-      <w:r>
-        <w:t xml:space="preserve"> gère cette inversion.</w:t>
+        <w:t>ResNet-50 traite les couleurs en BGR, et non en RGB. Il faut donc inverser les channels. La fonction preprocess_input gère cette inversion.</w:t>
       </w:r>
     </w:p>
     <w:p>
@@ -295,15 +216,7 @@
         </w:numPr>
       </w:pPr>
       <w:r>
-        <w:t>Soustraction de la moyenne : Les pixels vont de 0 à 255. L’Ia préfère travailler avec des chiffres centrés autour de 0. En calculant la moyenne de toutes les couleurs de millions d’images (</w:t>
-      </w:r>
-      <w:proofErr w:type="spellStart"/>
-      <w:r>
-        <w:t>ImageNet</w:t>
-      </w:r>
-      <w:proofErr w:type="spellEnd"/>
-      <w:r>
-        <w:t>), on a obtenu un tableau de moyenne. En les soustrayant, on enlève l’influence de l’éclairage moyen. L’IA réussit à se concentrer sur les formes.</w:t>
+        <w:t>Soustraction de la moyenne : Les pixels vont de 0 à 255. L’Ia préfère travailler avec des chiffres centrés autour de 0. En calculant la moyenne de toutes les couleurs de millions d’images (ImageNet), on a obtenu un tableau de moyenne. En les soustrayant, on enlève l’influence de l’éclairage moyen. L’IA réussit à se concentrer sur les formes.</w:t>
       </w:r>
     </w:p>
     <w:p>
@@ -314,51 +227,14 @@
           <w:numId w:val="2"/>
         </w:numPr>
       </w:pPr>
-      <w:proofErr w:type="spellStart"/>
-      <w:r>
-        <w:t>Predict</w:t>
-      </w:r>
-      <w:proofErr w:type="spellEnd"/>
-      <w:r>
-        <w:t xml:space="preserve"> &amp; </w:t>
-      </w:r>
-      <w:proofErr w:type="spellStart"/>
-      <w:r>
-        <w:t>argmax</w:t>
-      </w:r>
-      <w:proofErr w:type="spellEnd"/>
-      <w:r>
-        <w:t xml:space="preserve"> : </w:t>
-      </w:r>
-      <w:proofErr w:type="spellStart"/>
-      <w:r>
-        <w:t>model.predict</w:t>
-      </w:r>
-      <w:proofErr w:type="spellEnd"/>
-      <w:r>
-        <w:t>(image) ne renvoie pas</w:t>
+      <w:r>
+        <w:t>Predict &amp; argmax : model.predict(image) ne renvoie pas</w:t>
       </w:r>
       <w:r>
         <w:t xml:space="preserve"> « c’est une voiture », il renvoie une liste de 1000 nombres, avec toutes les probabilités d’appartenance </w:t>
       </w:r>
       <w:r>
-        <w:t>aux 1000 classes d’</w:t>
-      </w:r>
-      <w:proofErr w:type="spellStart"/>
-      <w:r>
-        <w:t>ilmage</w:t>
-      </w:r>
-      <w:proofErr w:type="spellEnd"/>
-      <w:r>
-        <w:t xml:space="preserve"> net. L’</w:t>
-      </w:r>
-      <w:proofErr w:type="spellStart"/>
-      <w:r>
-        <w:t>agrmax</w:t>
-      </w:r>
-      <w:proofErr w:type="spellEnd"/>
-      <w:r>
-        <w:t xml:space="preserve"> est la fonction qui cherche la position du plus grand nombre. </w:t>
+        <w:t xml:space="preserve">aux 1000 classes d’ilmage net. L’agrmax est la fonction qui cherche la position du plus grand nombre. </w:t>
       </w:r>
     </w:p>
     <w:p>
@@ -413,33 +289,2085 @@
     </w:p>
     <w:p>
       <w:r>
-        <w:t xml:space="preserve">Cuda n’est pas compatible avec </w:t>
-      </w:r>
-      <w:proofErr w:type="spellStart"/>
-      <w:r>
-        <w:t>TensorFlow</w:t>
-      </w:r>
-      <w:proofErr w:type="spellEnd"/>
-      <w:r>
-        <w:t xml:space="preserve"> sur Windows, donc je ne peux pas faire tourner sur le GPU. Je passe tout en </w:t>
-      </w:r>
-      <w:proofErr w:type="spellStart"/>
-      <w:r>
-        <w:t>PyTorch</w:t>
-      </w:r>
-      <w:proofErr w:type="spellEnd"/>
-      <w:r>
-        <w:t xml:space="preserve">. Plus besoin de tout mettre en BGR. </w:t>
-      </w:r>
-      <w:proofErr w:type="spellStart"/>
-      <w:r>
-        <w:t>Parcontre</w:t>
-      </w:r>
-      <w:proofErr w:type="spellEnd"/>
-      <w:r>
-        <w:t xml:space="preserve"> il faut toujours un Tenseur 4D en entrée. </w:t>
-      </w:r>
-    </w:p>
+        <w:t xml:space="preserve">Cuda n’est pas compatible avec TensorFlow sur Windows, donc je ne peux pas faire tourner sur le GPU. Je passe tout en PyTorch. Plus besoin de tout mettre en BGR. Parcontre il faut toujours un Tenseur 4D en entrée. </w:t>
+      </w:r>
+    </w:p>
+    <w:p/>
+    <w:p>
+      <w:pPr>
+        <w:pStyle w:val="Titre2"/>
+      </w:pPr>
+    </w:p>
+    <w:p/>
+    <w:p>
+      <w:pPr>
+        <w:pStyle w:val="Titre2"/>
+      </w:pPr>
+    </w:p>
+    <w:p>
+      <w:pPr>
+        <w:pStyle w:val="Titre2"/>
+      </w:pPr>
+      <w:r>
+        <w:t>Modèles </w:t>
+      </w:r>
+    </w:p>
+    <w:p>
+      <w:pPr>
+        <w:pStyle w:val="Titre3"/>
+      </w:pPr>
+      <w:r>
+        <w:t>1</w:t>
+      </w:r>
+      <w:r>
+        <w:rPr>
+          <w:vertAlign w:val="superscript"/>
+        </w:rPr>
+        <w:t>er</w:t>
+      </w:r>
+      <w:r>
+        <w:t xml:space="preserve"> modèle</w:t>
+      </w:r>
+    </w:p>
+    <w:p>
+      <w:r>
+        <w:t xml:space="preserve">Mon tout premier modèle : ResNet – 50 avec juste une couche de sortie avec cross entropy loss à la fin. Pas d’augmentation de données, pas de pénalité supérieure pour les petites classes. </w:t>
+      </w:r>
+    </w:p>
+    <w:tbl>
+      <w:tblPr>
+        <w:tblW w:w="0" w:type="auto"/>
+        <w:tblCellSpacing w:w="15" w:type="dxa"/>
+        <w:tblCellMar>
+          <w:left w:w="0" w:type="dxa"/>
+          <w:right w:w="0" w:type="dxa"/>
+        </w:tblCellMar>
+        <w:tblLook w:val="04A0" w:firstRow="1" w:lastRow="0" w:firstColumn="1" w:lastColumn="0" w:noHBand="0" w:noVBand="1"/>
+      </w:tblPr>
+      <w:tblGrid>
+        <w:gridCol w:w="1085"/>
+        <w:gridCol w:w="1131"/>
+        <w:gridCol w:w="1040"/>
+        <w:gridCol w:w="1354"/>
+      </w:tblGrid>
+      <w:tr>
+        <w:trPr>
+          <w:trHeight w:val="499"/>
+          <w:tblHeader/>
+          <w:tblCellSpacing w:w="15" w:type="dxa"/>
+        </w:trPr>
+        <w:tc>
+          <w:tcPr>
+            <w:tcW w:w="0" w:type="auto"/>
+            <w:tcBorders>
+              <w:top w:val="single" w:sz="6" w:space="0" w:color="auto"/>
+              <w:left w:val="single" w:sz="6" w:space="0" w:color="auto"/>
+              <w:bottom w:val="single" w:sz="6" w:space="0" w:color="auto"/>
+              <w:right w:val="single" w:sz="6" w:space="0" w:color="auto"/>
+            </w:tcBorders>
+            <w:tcMar>
+              <w:top w:w="240" w:type="dxa"/>
+              <w:left w:w="0" w:type="dxa"/>
+              <w:bottom w:w="240" w:type="dxa"/>
+              <w:right w:w="180" w:type="dxa"/>
+            </w:tcMar>
+            <w:vAlign w:val="center"/>
+            <w:hideMark/>
+          </w:tcPr>
+          <w:p>
+            <w:r>
+              <w:rPr>
+                <w:b/>
+                <w:bCs/>
+              </w:rPr>
+              <w:t>Époque</w:t>
+            </w:r>
+          </w:p>
+        </w:tc>
+        <w:tc>
+          <w:tcPr>
+            <w:tcW w:w="0" w:type="auto"/>
+            <w:tcBorders>
+              <w:top w:val="single" w:sz="6" w:space="0" w:color="auto"/>
+              <w:left w:val="single" w:sz="6" w:space="0" w:color="auto"/>
+              <w:bottom w:val="single" w:sz="6" w:space="0" w:color="auto"/>
+              <w:right w:val="single" w:sz="6" w:space="0" w:color="auto"/>
+            </w:tcBorders>
+            <w:tcMar>
+              <w:top w:w="240" w:type="dxa"/>
+              <w:left w:w="0" w:type="dxa"/>
+              <w:bottom w:w="240" w:type="dxa"/>
+              <w:right w:w="180" w:type="dxa"/>
+            </w:tcMar>
+            <w:vAlign w:val="center"/>
+            <w:hideMark/>
+          </w:tcPr>
+          <w:p>
+            <w:r>
+              <w:rPr>
+                <w:b/>
+                <w:bCs/>
+              </w:rPr>
+              <w:t>Val Loss</w:t>
+            </w:r>
+          </w:p>
+        </w:tc>
+        <w:tc>
+          <w:tcPr>
+            <w:tcW w:w="0" w:type="auto"/>
+            <w:tcBorders>
+              <w:top w:val="single" w:sz="6" w:space="0" w:color="auto"/>
+              <w:left w:val="single" w:sz="6" w:space="0" w:color="auto"/>
+              <w:bottom w:val="single" w:sz="6" w:space="0" w:color="auto"/>
+              <w:right w:val="single" w:sz="6" w:space="0" w:color="auto"/>
+            </w:tcBorders>
+            <w:tcMar>
+              <w:top w:w="240" w:type="dxa"/>
+              <w:left w:w="0" w:type="dxa"/>
+              <w:bottom w:w="240" w:type="dxa"/>
+              <w:right w:w="180" w:type="dxa"/>
+            </w:tcMar>
+            <w:vAlign w:val="center"/>
+            <w:hideMark/>
+          </w:tcPr>
+          <w:p>
+            <w:r>
+              <w:rPr>
+                <w:b/>
+                <w:bCs/>
+              </w:rPr>
+              <w:t>Val Acc</w:t>
+            </w:r>
+          </w:p>
+        </w:tc>
+        <w:tc>
+          <w:tcPr>
+            <w:tcW w:w="0" w:type="auto"/>
+            <w:tcBorders>
+              <w:top w:val="single" w:sz="6" w:space="0" w:color="auto"/>
+              <w:left w:val="single" w:sz="6" w:space="0" w:color="auto"/>
+              <w:bottom w:val="single" w:sz="6" w:space="0" w:color="auto"/>
+              <w:right w:val="single" w:sz="6" w:space="0" w:color="auto"/>
+            </w:tcBorders>
+            <w:tcMar>
+              <w:top w:w="240" w:type="dxa"/>
+              <w:left w:w="0" w:type="dxa"/>
+              <w:bottom w:w="240" w:type="dxa"/>
+              <w:right w:w="0" w:type="dxa"/>
+            </w:tcMar>
+            <w:vAlign w:val="center"/>
+            <w:hideMark/>
+          </w:tcPr>
+          <w:p>
+            <w:r>
+              <w:rPr>
+                <w:b/>
+                <w:bCs/>
+              </w:rPr>
+              <w:t>Sauvegardé</w:t>
+            </w:r>
+          </w:p>
+        </w:tc>
+      </w:tr>
+      <w:tr>
+        <w:trPr>
+          <w:trHeight w:val="499"/>
+          <w:tblCellSpacing w:w="15" w:type="dxa"/>
+        </w:trPr>
+        <w:tc>
+          <w:tcPr>
+            <w:tcW w:w="0" w:type="auto"/>
+            <w:tcBorders>
+              <w:top w:val="single" w:sz="6" w:space="0" w:color="auto"/>
+              <w:left w:val="single" w:sz="6" w:space="0" w:color="auto"/>
+              <w:bottom w:val="single" w:sz="6" w:space="0" w:color="auto"/>
+              <w:right w:val="single" w:sz="6" w:space="0" w:color="auto"/>
+            </w:tcBorders>
+            <w:tcMar>
+              <w:top w:w="240" w:type="dxa"/>
+              <w:left w:w="0" w:type="dxa"/>
+              <w:bottom w:w="240" w:type="dxa"/>
+              <w:right w:w="180" w:type="dxa"/>
+            </w:tcMar>
+            <w:vAlign w:val="center"/>
+            <w:hideMark/>
+          </w:tcPr>
+          <w:p>
+            <w:r>
+              <w:rPr>
+                <w:b/>
+                <w:bCs/>
+              </w:rPr>
+              <w:t>1</w:t>
+            </w:r>
+          </w:p>
+        </w:tc>
+        <w:tc>
+          <w:tcPr>
+            <w:tcW w:w="0" w:type="auto"/>
+            <w:tcBorders>
+              <w:top w:val="single" w:sz="6" w:space="0" w:color="auto"/>
+              <w:left w:val="single" w:sz="6" w:space="0" w:color="auto"/>
+              <w:bottom w:val="single" w:sz="6" w:space="0" w:color="auto"/>
+              <w:right w:val="single" w:sz="6" w:space="0" w:color="auto"/>
+            </w:tcBorders>
+            <w:tcMar>
+              <w:top w:w="240" w:type="dxa"/>
+              <w:left w:w="0" w:type="dxa"/>
+              <w:bottom w:w="240" w:type="dxa"/>
+              <w:right w:w="180" w:type="dxa"/>
+            </w:tcMar>
+            <w:vAlign w:val="center"/>
+            <w:hideMark/>
+          </w:tcPr>
+          <w:p>
+            <w:r>
+              <w:t>1.7928</w:t>
+            </w:r>
+          </w:p>
+        </w:tc>
+        <w:tc>
+          <w:tcPr>
+            <w:tcW w:w="0" w:type="auto"/>
+            <w:tcBorders>
+              <w:top w:val="single" w:sz="6" w:space="0" w:color="auto"/>
+              <w:left w:val="single" w:sz="6" w:space="0" w:color="auto"/>
+              <w:bottom w:val="single" w:sz="6" w:space="0" w:color="auto"/>
+              <w:right w:val="single" w:sz="6" w:space="0" w:color="auto"/>
+            </w:tcBorders>
+            <w:tcMar>
+              <w:top w:w="240" w:type="dxa"/>
+              <w:left w:w="0" w:type="dxa"/>
+              <w:bottom w:w="240" w:type="dxa"/>
+              <w:right w:w="180" w:type="dxa"/>
+            </w:tcMar>
+            <w:vAlign w:val="center"/>
+            <w:hideMark/>
+          </w:tcPr>
+          <w:p>
+            <w:r>
+              <w:t>0.4491</w:t>
+            </w:r>
+          </w:p>
+        </w:tc>
+        <w:tc>
+          <w:tcPr>
+            <w:tcW w:w="0" w:type="auto"/>
+            <w:tcBorders>
+              <w:top w:val="single" w:sz="6" w:space="0" w:color="auto"/>
+              <w:left w:val="single" w:sz="6" w:space="0" w:color="auto"/>
+              <w:bottom w:val="single" w:sz="6" w:space="0" w:color="auto"/>
+              <w:right w:val="single" w:sz="6" w:space="0" w:color="auto"/>
+            </w:tcBorders>
+            <w:tcMar>
+              <w:top w:w="240" w:type="dxa"/>
+              <w:left w:w="0" w:type="dxa"/>
+              <w:bottom w:w="240" w:type="dxa"/>
+              <w:right w:w="0" w:type="dxa"/>
+            </w:tcMar>
+            <w:vAlign w:val="center"/>
+            <w:hideMark/>
+          </w:tcPr>
+          <w:p>
+            <w:r>
+              <w:t>Oui</w:t>
+            </w:r>
+          </w:p>
+        </w:tc>
+      </w:tr>
+      <w:tr>
+        <w:trPr>
+          <w:trHeight w:val="500"/>
+          <w:tblCellSpacing w:w="15" w:type="dxa"/>
+        </w:trPr>
+        <w:tc>
+          <w:tcPr>
+            <w:tcW w:w="0" w:type="auto"/>
+            <w:tcBorders>
+              <w:top w:val="single" w:sz="6" w:space="0" w:color="auto"/>
+              <w:left w:val="single" w:sz="6" w:space="0" w:color="auto"/>
+              <w:bottom w:val="single" w:sz="6" w:space="0" w:color="auto"/>
+              <w:right w:val="single" w:sz="6" w:space="0" w:color="auto"/>
+            </w:tcBorders>
+            <w:tcMar>
+              <w:top w:w="240" w:type="dxa"/>
+              <w:left w:w="0" w:type="dxa"/>
+              <w:bottom w:w="240" w:type="dxa"/>
+              <w:right w:w="180" w:type="dxa"/>
+            </w:tcMar>
+            <w:vAlign w:val="center"/>
+            <w:hideMark/>
+          </w:tcPr>
+          <w:p>
+            <w:r>
+              <w:rPr>
+                <w:b/>
+                <w:bCs/>
+              </w:rPr>
+              <w:t>2</w:t>
+            </w:r>
+          </w:p>
+        </w:tc>
+        <w:tc>
+          <w:tcPr>
+            <w:tcW w:w="0" w:type="auto"/>
+            <w:tcBorders>
+              <w:top w:val="single" w:sz="6" w:space="0" w:color="auto"/>
+              <w:left w:val="single" w:sz="6" w:space="0" w:color="auto"/>
+              <w:bottom w:val="single" w:sz="6" w:space="0" w:color="auto"/>
+              <w:right w:val="single" w:sz="6" w:space="0" w:color="auto"/>
+            </w:tcBorders>
+            <w:tcMar>
+              <w:top w:w="240" w:type="dxa"/>
+              <w:left w:w="0" w:type="dxa"/>
+              <w:bottom w:w="240" w:type="dxa"/>
+              <w:right w:w="180" w:type="dxa"/>
+            </w:tcMar>
+            <w:vAlign w:val="center"/>
+            <w:hideMark/>
+          </w:tcPr>
+          <w:p>
+            <w:r>
+              <w:t>1.7202</w:t>
+            </w:r>
+          </w:p>
+        </w:tc>
+        <w:tc>
+          <w:tcPr>
+            <w:tcW w:w="0" w:type="auto"/>
+            <w:tcBorders>
+              <w:top w:val="single" w:sz="6" w:space="0" w:color="auto"/>
+              <w:left w:val="single" w:sz="6" w:space="0" w:color="auto"/>
+              <w:bottom w:val="single" w:sz="6" w:space="0" w:color="auto"/>
+              <w:right w:val="single" w:sz="6" w:space="0" w:color="auto"/>
+            </w:tcBorders>
+            <w:tcMar>
+              <w:top w:w="240" w:type="dxa"/>
+              <w:left w:w="0" w:type="dxa"/>
+              <w:bottom w:w="240" w:type="dxa"/>
+              <w:right w:w="180" w:type="dxa"/>
+            </w:tcMar>
+            <w:vAlign w:val="center"/>
+            <w:hideMark/>
+          </w:tcPr>
+          <w:p>
+            <w:r>
+              <w:t>0.4531</w:t>
+            </w:r>
+          </w:p>
+        </w:tc>
+        <w:tc>
+          <w:tcPr>
+            <w:tcW w:w="0" w:type="auto"/>
+            <w:tcBorders>
+              <w:top w:val="single" w:sz="6" w:space="0" w:color="auto"/>
+              <w:left w:val="single" w:sz="6" w:space="0" w:color="auto"/>
+              <w:bottom w:val="single" w:sz="6" w:space="0" w:color="auto"/>
+              <w:right w:val="single" w:sz="6" w:space="0" w:color="auto"/>
+            </w:tcBorders>
+            <w:tcMar>
+              <w:top w:w="240" w:type="dxa"/>
+              <w:left w:w="0" w:type="dxa"/>
+              <w:bottom w:w="240" w:type="dxa"/>
+              <w:right w:w="0" w:type="dxa"/>
+            </w:tcMar>
+            <w:vAlign w:val="center"/>
+            <w:hideMark/>
+          </w:tcPr>
+          <w:p>
+            <w:r>
+              <w:t>Oui</w:t>
+            </w:r>
+          </w:p>
+        </w:tc>
+      </w:tr>
+      <w:tr>
+        <w:trPr>
+          <w:trHeight w:val="499"/>
+          <w:tblCellSpacing w:w="15" w:type="dxa"/>
+        </w:trPr>
+        <w:tc>
+          <w:tcPr>
+            <w:tcW w:w="0" w:type="auto"/>
+            <w:tcBorders>
+              <w:top w:val="single" w:sz="6" w:space="0" w:color="auto"/>
+              <w:left w:val="single" w:sz="6" w:space="0" w:color="auto"/>
+              <w:bottom w:val="single" w:sz="6" w:space="0" w:color="auto"/>
+              <w:right w:val="single" w:sz="6" w:space="0" w:color="auto"/>
+            </w:tcBorders>
+            <w:tcMar>
+              <w:top w:w="240" w:type="dxa"/>
+              <w:left w:w="0" w:type="dxa"/>
+              <w:bottom w:w="240" w:type="dxa"/>
+              <w:right w:w="180" w:type="dxa"/>
+            </w:tcMar>
+            <w:vAlign w:val="center"/>
+            <w:hideMark/>
+          </w:tcPr>
+          <w:p>
+            <w:r>
+              <w:rPr>
+                <w:b/>
+                <w:bCs/>
+              </w:rPr>
+              <w:t>3</w:t>
+            </w:r>
+          </w:p>
+        </w:tc>
+        <w:tc>
+          <w:tcPr>
+            <w:tcW w:w="0" w:type="auto"/>
+            <w:tcBorders>
+              <w:top w:val="single" w:sz="6" w:space="0" w:color="auto"/>
+              <w:left w:val="single" w:sz="6" w:space="0" w:color="auto"/>
+              <w:bottom w:val="single" w:sz="6" w:space="0" w:color="auto"/>
+              <w:right w:val="single" w:sz="6" w:space="0" w:color="auto"/>
+            </w:tcBorders>
+            <w:tcMar>
+              <w:top w:w="240" w:type="dxa"/>
+              <w:left w:w="0" w:type="dxa"/>
+              <w:bottom w:w="240" w:type="dxa"/>
+              <w:right w:w="180" w:type="dxa"/>
+            </w:tcMar>
+            <w:vAlign w:val="center"/>
+            <w:hideMark/>
+          </w:tcPr>
+          <w:p>
+            <w:r>
+              <w:t>1.7770</w:t>
+            </w:r>
+          </w:p>
+        </w:tc>
+        <w:tc>
+          <w:tcPr>
+            <w:tcW w:w="0" w:type="auto"/>
+            <w:tcBorders>
+              <w:top w:val="single" w:sz="6" w:space="0" w:color="auto"/>
+              <w:left w:val="single" w:sz="6" w:space="0" w:color="auto"/>
+              <w:bottom w:val="single" w:sz="6" w:space="0" w:color="auto"/>
+              <w:right w:val="single" w:sz="6" w:space="0" w:color="auto"/>
+            </w:tcBorders>
+            <w:tcMar>
+              <w:top w:w="240" w:type="dxa"/>
+              <w:left w:w="0" w:type="dxa"/>
+              <w:bottom w:w="240" w:type="dxa"/>
+              <w:right w:w="180" w:type="dxa"/>
+            </w:tcMar>
+            <w:vAlign w:val="center"/>
+            <w:hideMark/>
+          </w:tcPr>
+          <w:p>
+            <w:r>
+              <w:t>0.4581</w:t>
+            </w:r>
+          </w:p>
+        </w:tc>
+        <w:tc>
+          <w:tcPr>
+            <w:tcW w:w="0" w:type="auto"/>
+            <w:tcBorders>
+              <w:top w:val="single" w:sz="6" w:space="0" w:color="auto"/>
+              <w:left w:val="single" w:sz="6" w:space="0" w:color="auto"/>
+              <w:bottom w:val="single" w:sz="6" w:space="0" w:color="auto"/>
+              <w:right w:val="single" w:sz="6" w:space="0" w:color="auto"/>
+            </w:tcBorders>
+            <w:tcMar>
+              <w:top w:w="240" w:type="dxa"/>
+              <w:left w:w="0" w:type="dxa"/>
+              <w:bottom w:w="240" w:type="dxa"/>
+              <w:right w:w="0" w:type="dxa"/>
+            </w:tcMar>
+            <w:vAlign w:val="center"/>
+            <w:hideMark/>
+          </w:tcPr>
+          <w:p>
+            <w:r>
+              <w:t>Non</w:t>
+            </w:r>
+          </w:p>
+        </w:tc>
+      </w:tr>
+      <w:tr>
+        <w:trPr>
+          <w:trHeight w:val="499"/>
+          <w:tblCellSpacing w:w="15" w:type="dxa"/>
+        </w:trPr>
+        <w:tc>
+          <w:tcPr>
+            <w:tcW w:w="0" w:type="auto"/>
+            <w:tcBorders>
+              <w:top w:val="single" w:sz="6" w:space="0" w:color="auto"/>
+              <w:left w:val="single" w:sz="6" w:space="0" w:color="auto"/>
+              <w:bottom w:val="single" w:sz="6" w:space="0" w:color="auto"/>
+              <w:right w:val="single" w:sz="6" w:space="0" w:color="auto"/>
+            </w:tcBorders>
+            <w:tcMar>
+              <w:top w:w="240" w:type="dxa"/>
+              <w:left w:w="0" w:type="dxa"/>
+              <w:bottom w:w="240" w:type="dxa"/>
+              <w:right w:w="180" w:type="dxa"/>
+            </w:tcMar>
+            <w:vAlign w:val="center"/>
+            <w:hideMark/>
+          </w:tcPr>
+          <w:p>
+            <w:r>
+              <w:rPr>
+                <w:b/>
+                <w:bCs/>
+              </w:rPr>
+              <w:t>4</w:t>
+            </w:r>
+          </w:p>
+        </w:tc>
+        <w:tc>
+          <w:tcPr>
+            <w:tcW w:w="0" w:type="auto"/>
+            <w:tcBorders>
+              <w:top w:val="single" w:sz="6" w:space="0" w:color="auto"/>
+              <w:left w:val="single" w:sz="6" w:space="0" w:color="auto"/>
+              <w:bottom w:val="single" w:sz="6" w:space="0" w:color="auto"/>
+              <w:right w:val="single" w:sz="6" w:space="0" w:color="auto"/>
+            </w:tcBorders>
+            <w:tcMar>
+              <w:top w:w="240" w:type="dxa"/>
+              <w:left w:w="0" w:type="dxa"/>
+              <w:bottom w:w="240" w:type="dxa"/>
+              <w:right w:w="180" w:type="dxa"/>
+            </w:tcMar>
+            <w:vAlign w:val="center"/>
+            <w:hideMark/>
+          </w:tcPr>
+          <w:p>
+            <w:r>
+              <w:t>1.7567</w:t>
+            </w:r>
+          </w:p>
+        </w:tc>
+        <w:tc>
+          <w:tcPr>
+            <w:tcW w:w="0" w:type="auto"/>
+            <w:tcBorders>
+              <w:top w:val="single" w:sz="6" w:space="0" w:color="auto"/>
+              <w:left w:val="single" w:sz="6" w:space="0" w:color="auto"/>
+              <w:bottom w:val="single" w:sz="6" w:space="0" w:color="auto"/>
+              <w:right w:val="single" w:sz="6" w:space="0" w:color="auto"/>
+            </w:tcBorders>
+            <w:tcMar>
+              <w:top w:w="240" w:type="dxa"/>
+              <w:left w:w="0" w:type="dxa"/>
+              <w:bottom w:w="240" w:type="dxa"/>
+              <w:right w:w="180" w:type="dxa"/>
+            </w:tcMar>
+            <w:vAlign w:val="center"/>
+            <w:hideMark/>
+          </w:tcPr>
+          <w:p>
+            <w:r>
+              <w:t>0.4530</w:t>
+            </w:r>
+          </w:p>
+        </w:tc>
+        <w:tc>
+          <w:tcPr>
+            <w:tcW w:w="0" w:type="auto"/>
+            <w:tcBorders>
+              <w:top w:val="single" w:sz="6" w:space="0" w:color="auto"/>
+              <w:left w:val="single" w:sz="6" w:space="0" w:color="auto"/>
+              <w:bottom w:val="single" w:sz="6" w:space="0" w:color="auto"/>
+              <w:right w:val="single" w:sz="6" w:space="0" w:color="auto"/>
+            </w:tcBorders>
+            <w:tcMar>
+              <w:top w:w="240" w:type="dxa"/>
+              <w:left w:w="0" w:type="dxa"/>
+              <w:bottom w:w="240" w:type="dxa"/>
+              <w:right w:w="0" w:type="dxa"/>
+            </w:tcMar>
+            <w:vAlign w:val="center"/>
+            <w:hideMark/>
+          </w:tcPr>
+          <w:p>
+            <w:r>
+              <w:t>Non</w:t>
+            </w:r>
+          </w:p>
+        </w:tc>
+      </w:tr>
+      <w:tr>
+        <w:trPr>
+          <w:trHeight w:val="500"/>
+          <w:tblCellSpacing w:w="15" w:type="dxa"/>
+        </w:trPr>
+        <w:tc>
+          <w:tcPr>
+            <w:tcW w:w="0" w:type="auto"/>
+            <w:tcBorders>
+              <w:top w:val="single" w:sz="6" w:space="0" w:color="auto"/>
+              <w:left w:val="single" w:sz="6" w:space="0" w:color="auto"/>
+              <w:bottom w:val="single" w:sz="6" w:space="0" w:color="auto"/>
+              <w:right w:val="single" w:sz="6" w:space="0" w:color="auto"/>
+            </w:tcBorders>
+            <w:tcMar>
+              <w:top w:w="240" w:type="dxa"/>
+              <w:left w:w="0" w:type="dxa"/>
+              <w:bottom w:w="240" w:type="dxa"/>
+              <w:right w:w="180" w:type="dxa"/>
+            </w:tcMar>
+            <w:vAlign w:val="center"/>
+            <w:hideMark/>
+          </w:tcPr>
+          <w:p>
+            <w:r>
+              <w:rPr>
+                <w:b/>
+                <w:bCs/>
+              </w:rPr>
+              <w:t>5</w:t>
+            </w:r>
+          </w:p>
+        </w:tc>
+        <w:tc>
+          <w:tcPr>
+            <w:tcW w:w="0" w:type="auto"/>
+            <w:tcBorders>
+              <w:top w:val="single" w:sz="6" w:space="0" w:color="auto"/>
+              <w:left w:val="single" w:sz="6" w:space="0" w:color="auto"/>
+              <w:bottom w:val="single" w:sz="6" w:space="0" w:color="auto"/>
+              <w:right w:val="single" w:sz="6" w:space="0" w:color="auto"/>
+            </w:tcBorders>
+            <w:tcMar>
+              <w:top w:w="240" w:type="dxa"/>
+              <w:left w:w="0" w:type="dxa"/>
+              <w:bottom w:w="240" w:type="dxa"/>
+              <w:right w:w="180" w:type="dxa"/>
+            </w:tcMar>
+            <w:vAlign w:val="center"/>
+            <w:hideMark/>
+          </w:tcPr>
+          <w:p>
+            <w:r>
+              <w:t>1.6391</w:t>
+            </w:r>
+          </w:p>
+        </w:tc>
+        <w:tc>
+          <w:tcPr>
+            <w:tcW w:w="0" w:type="auto"/>
+            <w:tcBorders>
+              <w:top w:val="single" w:sz="6" w:space="0" w:color="auto"/>
+              <w:left w:val="single" w:sz="6" w:space="0" w:color="auto"/>
+              <w:bottom w:val="single" w:sz="6" w:space="0" w:color="auto"/>
+              <w:right w:val="single" w:sz="6" w:space="0" w:color="auto"/>
+            </w:tcBorders>
+            <w:tcMar>
+              <w:top w:w="240" w:type="dxa"/>
+              <w:left w:w="0" w:type="dxa"/>
+              <w:bottom w:w="240" w:type="dxa"/>
+              <w:right w:w="180" w:type="dxa"/>
+            </w:tcMar>
+            <w:vAlign w:val="center"/>
+            <w:hideMark/>
+          </w:tcPr>
+          <w:p>
+            <w:r>
+              <w:t>0.4884</w:t>
+            </w:r>
+          </w:p>
+        </w:tc>
+        <w:tc>
+          <w:tcPr>
+            <w:tcW w:w="0" w:type="auto"/>
+            <w:tcBorders>
+              <w:top w:val="single" w:sz="6" w:space="0" w:color="auto"/>
+              <w:left w:val="single" w:sz="6" w:space="0" w:color="auto"/>
+              <w:bottom w:val="single" w:sz="6" w:space="0" w:color="auto"/>
+              <w:right w:val="single" w:sz="6" w:space="0" w:color="auto"/>
+            </w:tcBorders>
+            <w:tcMar>
+              <w:top w:w="240" w:type="dxa"/>
+              <w:left w:w="0" w:type="dxa"/>
+              <w:bottom w:w="240" w:type="dxa"/>
+              <w:right w:w="0" w:type="dxa"/>
+            </w:tcMar>
+            <w:vAlign w:val="center"/>
+            <w:hideMark/>
+          </w:tcPr>
+          <w:p>
+            <w:r>
+              <w:t>Oui</w:t>
+            </w:r>
+          </w:p>
+        </w:tc>
+      </w:tr>
+      <w:tr>
+        <w:trPr>
+          <w:trHeight w:val="499"/>
+          <w:tblCellSpacing w:w="15" w:type="dxa"/>
+        </w:trPr>
+        <w:tc>
+          <w:tcPr>
+            <w:tcW w:w="0" w:type="auto"/>
+            <w:tcBorders>
+              <w:top w:val="single" w:sz="6" w:space="0" w:color="auto"/>
+              <w:left w:val="single" w:sz="6" w:space="0" w:color="auto"/>
+              <w:bottom w:val="single" w:sz="6" w:space="0" w:color="auto"/>
+              <w:right w:val="single" w:sz="6" w:space="0" w:color="auto"/>
+            </w:tcBorders>
+            <w:tcMar>
+              <w:top w:w="240" w:type="dxa"/>
+              <w:left w:w="0" w:type="dxa"/>
+              <w:bottom w:w="240" w:type="dxa"/>
+              <w:right w:w="180" w:type="dxa"/>
+            </w:tcMar>
+            <w:vAlign w:val="center"/>
+            <w:hideMark/>
+          </w:tcPr>
+          <w:p>
+            <w:r>
+              <w:rPr>
+                <w:b/>
+                <w:bCs/>
+              </w:rPr>
+              <w:t>6</w:t>
+            </w:r>
+          </w:p>
+        </w:tc>
+        <w:tc>
+          <w:tcPr>
+            <w:tcW w:w="0" w:type="auto"/>
+            <w:tcBorders>
+              <w:top w:val="single" w:sz="6" w:space="0" w:color="auto"/>
+              <w:left w:val="single" w:sz="6" w:space="0" w:color="auto"/>
+              <w:bottom w:val="single" w:sz="6" w:space="0" w:color="auto"/>
+              <w:right w:val="single" w:sz="6" w:space="0" w:color="auto"/>
+            </w:tcBorders>
+            <w:tcMar>
+              <w:top w:w="240" w:type="dxa"/>
+              <w:left w:w="0" w:type="dxa"/>
+              <w:bottom w:w="240" w:type="dxa"/>
+              <w:right w:w="180" w:type="dxa"/>
+            </w:tcMar>
+            <w:vAlign w:val="center"/>
+            <w:hideMark/>
+          </w:tcPr>
+          <w:p>
+            <w:r>
+              <w:t>1.6877</w:t>
+            </w:r>
+          </w:p>
+        </w:tc>
+        <w:tc>
+          <w:tcPr>
+            <w:tcW w:w="0" w:type="auto"/>
+            <w:tcBorders>
+              <w:top w:val="single" w:sz="6" w:space="0" w:color="auto"/>
+              <w:left w:val="single" w:sz="6" w:space="0" w:color="auto"/>
+              <w:bottom w:val="single" w:sz="6" w:space="0" w:color="auto"/>
+              <w:right w:val="single" w:sz="6" w:space="0" w:color="auto"/>
+            </w:tcBorders>
+            <w:tcMar>
+              <w:top w:w="240" w:type="dxa"/>
+              <w:left w:w="0" w:type="dxa"/>
+              <w:bottom w:w="240" w:type="dxa"/>
+              <w:right w:w="180" w:type="dxa"/>
+            </w:tcMar>
+            <w:vAlign w:val="center"/>
+            <w:hideMark/>
+          </w:tcPr>
+          <w:p>
+            <w:r>
+              <w:t>0.4706</w:t>
+            </w:r>
+          </w:p>
+        </w:tc>
+        <w:tc>
+          <w:tcPr>
+            <w:tcW w:w="0" w:type="auto"/>
+            <w:tcBorders>
+              <w:top w:val="single" w:sz="6" w:space="0" w:color="auto"/>
+              <w:left w:val="single" w:sz="6" w:space="0" w:color="auto"/>
+              <w:bottom w:val="single" w:sz="6" w:space="0" w:color="auto"/>
+              <w:right w:val="single" w:sz="6" w:space="0" w:color="auto"/>
+            </w:tcBorders>
+            <w:tcMar>
+              <w:top w:w="240" w:type="dxa"/>
+              <w:left w:w="0" w:type="dxa"/>
+              <w:bottom w:w="240" w:type="dxa"/>
+              <w:right w:w="0" w:type="dxa"/>
+            </w:tcMar>
+            <w:vAlign w:val="center"/>
+            <w:hideMark/>
+          </w:tcPr>
+          <w:p>
+            <w:r>
+              <w:t>Non</w:t>
+            </w:r>
+          </w:p>
+        </w:tc>
+      </w:tr>
+      <w:tr>
+        <w:trPr>
+          <w:trHeight w:val="499"/>
+          <w:tblCellSpacing w:w="15" w:type="dxa"/>
+        </w:trPr>
+        <w:tc>
+          <w:tcPr>
+            <w:tcW w:w="0" w:type="auto"/>
+            <w:tcBorders>
+              <w:top w:val="single" w:sz="6" w:space="0" w:color="auto"/>
+              <w:left w:val="single" w:sz="6" w:space="0" w:color="auto"/>
+              <w:bottom w:val="single" w:sz="6" w:space="0" w:color="auto"/>
+              <w:right w:val="single" w:sz="6" w:space="0" w:color="auto"/>
+            </w:tcBorders>
+            <w:tcMar>
+              <w:top w:w="240" w:type="dxa"/>
+              <w:left w:w="0" w:type="dxa"/>
+              <w:bottom w:w="240" w:type="dxa"/>
+              <w:right w:w="180" w:type="dxa"/>
+            </w:tcMar>
+            <w:vAlign w:val="center"/>
+            <w:hideMark/>
+          </w:tcPr>
+          <w:p>
+            <w:r>
+              <w:rPr>
+                <w:b/>
+                <w:bCs/>
+              </w:rPr>
+              <w:t>7</w:t>
+            </w:r>
+          </w:p>
+        </w:tc>
+        <w:tc>
+          <w:tcPr>
+            <w:tcW w:w="0" w:type="auto"/>
+            <w:tcBorders>
+              <w:top w:val="single" w:sz="6" w:space="0" w:color="auto"/>
+              <w:left w:val="single" w:sz="6" w:space="0" w:color="auto"/>
+              <w:bottom w:val="single" w:sz="6" w:space="0" w:color="auto"/>
+              <w:right w:val="single" w:sz="6" w:space="0" w:color="auto"/>
+            </w:tcBorders>
+            <w:tcMar>
+              <w:top w:w="240" w:type="dxa"/>
+              <w:left w:w="0" w:type="dxa"/>
+              <w:bottom w:w="240" w:type="dxa"/>
+              <w:right w:w="180" w:type="dxa"/>
+            </w:tcMar>
+            <w:vAlign w:val="center"/>
+            <w:hideMark/>
+          </w:tcPr>
+          <w:p>
+            <w:r>
+              <w:t>1.6439</w:t>
+            </w:r>
+          </w:p>
+        </w:tc>
+        <w:tc>
+          <w:tcPr>
+            <w:tcW w:w="0" w:type="auto"/>
+            <w:tcBorders>
+              <w:top w:val="single" w:sz="6" w:space="0" w:color="auto"/>
+              <w:left w:val="single" w:sz="6" w:space="0" w:color="auto"/>
+              <w:bottom w:val="single" w:sz="6" w:space="0" w:color="auto"/>
+              <w:right w:val="single" w:sz="6" w:space="0" w:color="auto"/>
+            </w:tcBorders>
+            <w:tcMar>
+              <w:top w:w="240" w:type="dxa"/>
+              <w:left w:w="0" w:type="dxa"/>
+              <w:bottom w:w="240" w:type="dxa"/>
+              <w:right w:w="180" w:type="dxa"/>
+            </w:tcMar>
+            <w:vAlign w:val="center"/>
+            <w:hideMark/>
+          </w:tcPr>
+          <w:p>
+            <w:r>
+              <w:t>0.4881</w:t>
+            </w:r>
+          </w:p>
+        </w:tc>
+        <w:tc>
+          <w:tcPr>
+            <w:tcW w:w="0" w:type="auto"/>
+            <w:tcBorders>
+              <w:top w:val="single" w:sz="6" w:space="0" w:color="auto"/>
+              <w:left w:val="single" w:sz="6" w:space="0" w:color="auto"/>
+              <w:bottom w:val="single" w:sz="6" w:space="0" w:color="auto"/>
+              <w:right w:val="single" w:sz="6" w:space="0" w:color="auto"/>
+            </w:tcBorders>
+            <w:tcMar>
+              <w:top w:w="240" w:type="dxa"/>
+              <w:left w:w="0" w:type="dxa"/>
+              <w:bottom w:w="240" w:type="dxa"/>
+              <w:right w:w="0" w:type="dxa"/>
+            </w:tcMar>
+            <w:vAlign w:val="center"/>
+            <w:hideMark/>
+          </w:tcPr>
+          <w:p>
+            <w:r>
+              <w:t>Non</w:t>
+            </w:r>
+          </w:p>
+        </w:tc>
+      </w:tr>
+      <w:tr>
+        <w:trPr>
+          <w:trHeight w:val="500"/>
+          <w:tblCellSpacing w:w="15" w:type="dxa"/>
+        </w:trPr>
+        <w:tc>
+          <w:tcPr>
+            <w:tcW w:w="0" w:type="auto"/>
+            <w:tcBorders>
+              <w:top w:val="single" w:sz="6" w:space="0" w:color="auto"/>
+              <w:left w:val="single" w:sz="6" w:space="0" w:color="auto"/>
+              <w:bottom w:val="single" w:sz="6" w:space="0" w:color="auto"/>
+              <w:right w:val="single" w:sz="6" w:space="0" w:color="auto"/>
+            </w:tcBorders>
+            <w:tcMar>
+              <w:top w:w="240" w:type="dxa"/>
+              <w:left w:w="0" w:type="dxa"/>
+              <w:bottom w:w="240" w:type="dxa"/>
+              <w:right w:w="180" w:type="dxa"/>
+            </w:tcMar>
+            <w:vAlign w:val="center"/>
+            <w:hideMark/>
+          </w:tcPr>
+          <w:p>
+            <w:r>
+              <w:rPr>
+                <w:b/>
+                <w:bCs/>
+              </w:rPr>
+              <w:t>8</w:t>
+            </w:r>
+          </w:p>
+        </w:tc>
+        <w:tc>
+          <w:tcPr>
+            <w:tcW w:w="0" w:type="auto"/>
+            <w:tcBorders>
+              <w:top w:val="single" w:sz="6" w:space="0" w:color="auto"/>
+              <w:left w:val="single" w:sz="6" w:space="0" w:color="auto"/>
+              <w:bottom w:val="single" w:sz="6" w:space="0" w:color="auto"/>
+              <w:right w:val="single" w:sz="6" w:space="0" w:color="auto"/>
+            </w:tcBorders>
+            <w:tcMar>
+              <w:top w:w="240" w:type="dxa"/>
+              <w:left w:w="0" w:type="dxa"/>
+              <w:bottom w:w="240" w:type="dxa"/>
+              <w:right w:w="180" w:type="dxa"/>
+            </w:tcMar>
+            <w:vAlign w:val="center"/>
+            <w:hideMark/>
+          </w:tcPr>
+          <w:p>
+            <w:r>
+              <w:t>1.5812</w:t>
+            </w:r>
+          </w:p>
+        </w:tc>
+        <w:tc>
+          <w:tcPr>
+            <w:tcW w:w="0" w:type="auto"/>
+            <w:tcBorders>
+              <w:top w:val="single" w:sz="6" w:space="0" w:color="auto"/>
+              <w:left w:val="single" w:sz="6" w:space="0" w:color="auto"/>
+              <w:bottom w:val="single" w:sz="6" w:space="0" w:color="auto"/>
+              <w:right w:val="single" w:sz="6" w:space="0" w:color="auto"/>
+            </w:tcBorders>
+            <w:tcMar>
+              <w:top w:w="240" w:type="dxa"/>
+              <w:left w:w="0" w:type="dxa"/>
+              <w:bottom w:w="240" w:type="dxa"/>
+              <w:right w:w="180" w:type="dxa"/>
+            </w:tcMar>
+            <w:vAlign w:val="center"/>
+            <w:hideMark/>
+          </w:tcPr>
+          <w:p>
+            <w:r>
+              <w:t>0.5066</w:t>
+            </w:r>
+          </w:p>
+        </w:tc>
+        <w:tc>
+          <w:tcPr>
+            <w:tcW w:w="0" w:type="auto"/>
+            <w:tcBorders>
+              <w:top w:val="single" w:sz="6" w:space="0" w:color="auto"/>
+              <w:left w:val="single" w:sz="6" w:space="0" w:color="auto"/>
+              <w:bottom w:val="single" w:sz="6" w:space="0" w:color="auto"/>
+              <w:right w:val="single" w:sz="6" w:space="0" w:color="auto"/>
+            </w:tcBorders>
+            <w:tcMar>
+              <w:top w:w="240" w:type="dxa"/>
+              <w:left w:w="0" w:type="dxa"/>
+              <w:bottom w:w="240" w:type="dxa"/>
+              <w:right w:w="0" w:type="dxa"/>
+            </w:tcMar>
+            <w:vAlign w:val="center"/>
+            <w:hideMark/>
+          </w:tcPr>
+          <w:p>
+            <w:r>
+              <w:t>Oui</w:t>
+            </w:r>
+          </w:p>
+        </w:tc>
+      </w:tr>
+      <w:tr>
+        <w:trPr>
+          <w:trHeight w:val="499"/>
+          <w:tblCellSpacing w:w="15" w:type="dxa"/>
+        </w:trPr>
+        <w:tc>
+          <w:tcPr>
+            <w:tcW w:w="0" w:type="auto"/>
+            <w:tcBorders>
+              <w:top w:val="single" w:sz="6" w:space="0" w:color="auto"/>
+              <w:left w:val="single" w:sz="6" w:space="0" w:color="auto"/>
+              <w:bottom w:val="single" w:sz="6" w:space="0" w:color="auto"/>
+              <w:right w:val="single" w:sz="6" w:space="0" w:color="auto"/>
+            </w:tcBorders>
+            <w:tcMar>
+              <w:top w:w="240" w:type="dxa"/>
+              <w:left w:w="0" w:type="dxa"/>
+              <w:bottom w:w="240" w:type="dxa"/>
+              <w:right w:w="180" w:type="dxa"/>
+            </w:tcMar>
+            <w:vAlign w:val="center"/>
+            <w:hideMark/>
+          </w:tcPr>
+          <w:p>
+            <w:r>
+              <w:rPr>
+                <w:b/>
+                <w:bCs/>
+              </w:rPr>
+              <w:t>9</w:t>
+            </w:r>
+          </w:p>
+        </w:tc>
+        <w:tc>
+          <w:tcPr>
+            <w:tcW w:w="0" w:type="auto"/>
+            <w:tcBorders>
+              <w:top w:val="single" w:sz="6" w:space="0" w:color="auto"/>
+              <w:left w:val="single" w:sz="6" w:space="0" w:color="auto"/>
+              <w:bottom w:val="single" w:sz="6" w:space="0" w:color="auto"/>
+              <w:right w:val="single" w:sz="6" w:space="0" w:color="auto"/>
+            </w:tcBorders>
+            <w:tcMar>
+              <w:top w:w="240" w:type="dxa"/>
+              <w:left w:w="0" w:type="dxa"/>
+              <w:bottom w:w="240" w:type="dxa"/>
+              <w:right w:w="180" w:type="dxa"/>
+            </w:tcMar>
+            <w:vAlign w:val="center"/>
+            <w:hideMark/>
+          </w:tcPr>
+          <w:p>
+            <w:r>
+              <w:t>1.7364</w:t>
+            </w:r>
+          </w:p>
+        </w:tc>
+        <w:tc>
+          <w:tcPr>
+            <w:tcW w:w="0" w:type="auto"/>
+            <w:tcBorders>
+              <w:top w:val="single" w:sz="6" w:space="0" w:color="auto"/>
+              <w:left w:val="single" w:sz="6" w:space="0" w:color="auto"/>
+              <w:bottom w:val="single" w:sz="6" w:space="0" w:color="auto"/>
+              <w:right w:val="single" w:sz="6" w:space="0" w:color="auto"/>
+            </w:tcBorders>
+            <w:tcMar>
+              <w:top w:w="240" w:type="dxa"/>
+              <w:left w:w="0" w:type="dxa"/>
+              <w:bottom w:w="240" w:type="dxa"/>
+              <w:right w:w="180" w:type="dxa"/>
+            </w:tcMar>
+            <w:vAlign w:val="center"/>
+            <w:hideMark/>
+          </w:tcPr>
+          <w:p>
+            <w:r>
+              <w:t>0.4505</w:t>
+            </w:r>
+          </w:p>
+        </w:tc>
+        <w:tc>
+          <w:tcPr>
+            <w:tcW w:w="0" w:type="auto"/>
+            <w:tcBorders>
+              <w:top w:val="single" w:sz="6" w:space="0" w:color="auto"/>
+              <w:left w:val="single" w:sz="6" w:space="0" w:color="auto"/>
+              <w:bottom w:val="single" w:sz="6" w:space="0" w:color="auto"/>
+              <w:right w:val="single" w:sz="6" w:space="0" w:color="auto"/>
+            </w:tcBorders>
+            <w:tcMar>
+              <w:top w:w="240" w:type="dxa"/>
+              <w:left w:w="0" w:type="dxa"/>
+              <w:bottom w:w="240" w:type="dxa"/>
+              <w:right w:w="0" w:type="dxa"/>
+            </w:tcMar>
+            <w:vAlign w:val="center"/>
+            <w:hideMark/>
+          </w:tcPr>
+          <w:p>
+            <w:r>
+              <w:t>Non</w:t>
+            </w:r>
+          </w:p>
+        </w:tc>
+      </w:tr>
+      <w:tr>
+        <w:trPr>
+          <w:trHeight w:val="500"/>
+          <w:tblCellSpacing w:w="15" w:type="dxa"/>
+        </w:trPr>
+        <w:tc>
+          <w:tcPr>
+            <w:tcW w:w="0" w:type="auto"/>
+            <w:tcBorders>
+              <w:top w:val="single" w:sz="6" w:space="0" w:color="auto"/>
+              <w:left w:val="single" w:sz="6" w:space="0" w:color="auto"/>
+              <w:bottom w:val="single" w:sz="6" w:space="0" w:color="auto"/>
+              <w:right w:val="single" w:sz="6" w:space="0" w:color="auto"/>
+            </w:tcBorders>
+            <w:tcMar>
+              <w:top w:w="240" w:type="dxa"/>
+              <w:left w:w="0" w:type="dxa"/>
+              <w:bottom w:w="240" w:type="dxa"/>
+              <w:right w:w="180" w:type="dxa"/>
+            </w:tcMar>
+            <w:vAlign w:val="center"/>
+            <w:hideMark/>
+          </w:tcPr>
+          <w:p>
+            <w:r>
+              <w:rPr>
+                <w:b/>
+                <w:bCs/>
+              </w:rPr>
+              <w:lastRenderedPageBreak/>
+              <w:t>10</w:t>
+            </w:r>
+          </w:p>
+        </w:tc>
+        <w:tc>
+          <w:tcPr>
+            <w:tcW w:w="0" w:type="auto"/>
+            <w:tcBorders>
+              <w:top w:val="single" w:sz="6" w:space="0" w:color="auto"/>
+              <w:left w:val="single" w:sz="6" w:space="0" w:color="auto"/>
+              <w:bottom w:val="single" w:sz="6" w:space="0" w:color="auto"/>
+              <w:right w:val="single" w:sz="6" w:space="0" w:color="auto"/>
+            </w:tcBorders>
+            <w:tcMar>
+              <w:top w:w="240" w:type="dxa"/>
+              <w:left w:w="0" w:type="dxa"/>
+              <w:bottom w:w="240" w:type="dxa"/>
+              <w:right w:w="180" w:type="dxa"/>
+            </w:tcMar>
+            <w:vAlign w:val="center"/>
+            <w:hideMark/>
+          </w:tcPr>
+          <w:p>
+            <w:r>
+              <w:t>1.6397</w:t>
+            </w:r>
+          </w:p>
+        </w:tc>
+        <w:tc>
+          <w:tcPr>
+            <w:tcW w:w="0" w:type="auto"/>
+            <w:tcBorders>
+              <w:top w:val="single" w:sz="6" w:space="0" w:color="auto"/>
+              <w:left w:val="single" w:sz="6" w:space="0" w:color="auto"/>
+              <w:bottom w:val="single" w:sz="6" w:space="0" w:color="auto"/>
+              <w:right w:val="single" w:sz="6" w:space="0" w:color="auto"/>
+            </w:tcBorders>
+            <w:tcMar>
+              <w:top w:w="240" w:type="dxa"/>
+              <w:left w:w="0" w:type="dxa"/>
+              <w:bottom w:w="240" w:type="dxa"/>
+              <w:right w:w="180" w:type="dxa"/>
+            </w:tcMar>
+            <w:vAlign w:val="center"/>
+            <w:hideMark/>
+          </w:tcPr>
+          <w:p>
+            <w:r>
+              <w:t>0.4898</w:t>
+            </w:r>
+          </w:p>
+        </w:tc>
+        <w:tc>
+          <w:tcPr>
+            <w:tcW w:w="0" w:type="auto"/>
+            <w:tcBorders>
+              <w:top w:val="single" w:sz="6" w:space="0" w:color="auto"/>
+              <w:left w:val="single" w:sz="6" w:space="0" w:color="auto"/>
+              <w:bottom w:val="single" w:sz="6" w:space="0" w:color="auto"/>
+              <w:right w:val="single" w:sz="6" w:space="0" w:color="auto"/>
+            </w:tcBorders>
+            <w:tcMar>
+              <w:top w:w="240" w:type="dxa"/>
+              <w:left w:w="0" w:type="dxa"/>
+              <w:bottom w:w="240" w:type="dxa"/>
+              <w:right w:w="0" w:type="dxa"/>
+            </w:tcMar>
+            <w:vAlign w:val="center"/>
+            <w:hideMark/>
+          </w:tcPr>
+          <w:p>
+            <w:r>
+              <w:t>Non</w:t>
+            </w:r>
+          </w:p>
+        </w:tc>
+      </w:tr>
+    </w:tbl>
+    <w:p/>
+    <w:p>
+      <w:pPr>
+        <w:pStyle w:val="Titre3"/>
+      </w:pPr>
+      <w:r>
+        <w:t>Deuxième modèle : avec pénalités ajustées</w:t>
+      </w:r>
+    </w:p>
+    <w:p>
+      <w:r>
+        <w:t xml:space="preserve">38% d’accuracy -&gt; cela confirme que le modèle précédent apprenait que les classes étaient déséquilibrées. </w:t>
+      </w:r>
+    </w:p>
+    <w:p>
+      <w:pPr>
+        <w:pStyle w:val="Titre3"/>
+      </w:pPr>
+      <w:r>
+        <w:t>Troisième modèle : pénalités ajustées, dernière layer dégelée</w:t>
+      </w:r>
+    </w:p>
+    <w:p>
+      <w:r>
+        <w:rPr>
+          <w:b/>
+          <w:bCs/>
+        </w:rPr>
+        <w:t>1. Couches initiales (conv1 et layer1) : L'extraction de bas niveau</w:t>
+      </w:r>
+      <w:r>
+        <w:t xml:space="preserve"> Ces premières couches agissent comme des filtres primaires. Elles se chargent d'identifier les caractéristiques visuelles universelles : les lignes droites, les courbes, les contours, les forts contrastes et les dégradés de couleurs. Étant donné que ces motifs de base sont communs à toutes les images (qu'il s'agisse d'objets du quotidien ou de véhicules), les poids de ces couches ont été </w:t>
+      </w:r>
+      <w:r>
+        <w:rPr>
+          <w:b/>
+          <w:bCs/>
+        </w:rPr>
+        <w:t>gelés</w:t>
+      </w:r>
+      <w:r>
+        <w:t>. Le modèle conserve ainsi les excellentes fondations acquises lors de son pré-entraînement sur la base de données ImageNet.</w:t>
+      </w:r>
+    </w:p>
+    <w:p>
+      <w:r>
+        <w:rPr>
+          <w:b/>
+          <w:bCs/>
+        </w:rPr>
+        <w:t>2. Couches intermédiaires (layer2 et layer3) : L'assemblage des motifs</w:t>
+      </w:r>
+      <w:r>
+        <w:t xml:space="preserve"> À ce stade, le réseau combine les formes géométriques de base pour détecter des éléments plus élaborés. Le layer2 se concentre sur les textures et les motifs répétitifs (par exemple : grilles d'aération en nid d'abeille, reflets de carrosserie, rainures de pneus). Le layer3 assemble ces textures pour identifier des sous-parties de l'objet (la forme générale d'une roue, le contour d'un phare ou d'un rétroviseur).</w:t>
+      </w:r>
+    </w:p>
+    <w:p>
+      <w:r>
+        <w:rPr>
+          <w:b/>
+          <w:bCs/>
+        </w:rPr>
+        <w:t>3. Couches profondes (layer4) : L'extraction de haut niveau sémantique</w:t>
+      </w:r>
+      <w:r>
+        <w:t xml:space="preserve"> C'est le dernier bloc convolutif, chargé de reconnaître des concepts complexes et hautement identitaires. Dans le contexte de l'automobile, cette couche est capable d'identifier une calandre spécifique (ex: le double haricot de BMW), la forme exacte d'une signature lumineuse, ou un logo constructeur. </w:t>
+      </w:r>
+      <w:r>
+        <w:rPr>
+          <w:b/>
+          <w:bCs/>
+        </w:rPr>
+        <w:t>Ces couches ont été dégelées</w:t>
+      </w:r>
+      <w:r>
+        <w:t xml:space="preserve"> lors de la phase de </w:t>
+      </w:r>
+      <w:r>
+        <w:rPr>
+          <w:i/>
+          <w:iCs/>
+        </w:rPr>
+        <w:t>Fine-Tuning</w:t>
+      </w:r>
+      <w:r>
+        <w:t>. En autorisant la mise à jour de ces poids avec un faible taux d'apprentissage, nous avons forcé le réseau à oublier les concepts généralistes d'ImageNet pour devenir un expert spécialisé dans les caractéristiques distinctives de l'automobile.</w:t>
+      </w:r>
+    </w:p>
+    <w:p>
+      <w:r>
+        <w:rPr>
+          <w:b/>
+          <w:bCs/>
+        </w:rPr>
+        <w:t>4. Tête de Classification (Global Average Pooling et Couche Dense) : La décision finale</w:t>
+      </w:r>
+    </w:p>
+    <w:p>
+      <w:pPr>
+        <w:numPr>
+          <w:ilvl w:val="0"/>
+          <w:numId w:val="3"/>
+        </w:numPr>
+      </w:pPr>
+      <w:r>
+        <w:rPr>
+          <w:b/>
+          <w:bCs/>
+        </w:rPr>
+        <w:lastRenderedPageBreak/>
+        <w:t>Global Average Pooling (GAP) :</w:t>
+      </w:r>
+      <w:r>
+        <w:t xml:space="preserve"> Cette couche a pour rôle d'aplatir la carte de caractéristiques tridimensionnelle très complexe issue du layer4 en un vecteur unidimensionnel, résumant l'information essentielle de l'image.</w:t>
+      </w:r>
+    </w:p>
+    <w:p>
+      <w:pPr>
+        <w:numPr>
+          <w:ilvl w:val="0"/>
+          <w:numId w:val="3"/>
+        </w:numPr>
+      </w:pPr>
+      <w:r>
+        <w:rPr>
+          <w:b/>
+          <w:bCs/>
+        </w:rPr>
+        <w:t>Couche Dense (Fully Connected) :</w:t>
+      </w:r>
+      <w:r>
+        <w:t xml:space="preserve"> Cette couche finale, entièrement réinitialisée et entraînée depuis zéro, agit comme le classificateur probabiliste. Elle prend en entrée le vecteur résumé par le GAP, calcule le poids de chaque "preuve" visuelle accumulée par le réseau, et utilise une fonction </w:t>
+      </w:r>
+      <w:r>
+        <w:rPr>
+          <w:i/>
+          <w:iCs/>
+        </w:rPr>
+        <w:t>Softmax</w:t>
+      </w:r>
+      <w:r>
+        <w:t xml:space="preserve"> pour délivrer la prédiction finale parmi nos différentes classes de véhicules.</w:t>
+      </w:r>
+    </w:p>
+    <w:p>
+      <w:r>
+        <w:t xml:space="preserve">On obtient 88% d’accuracy et 0.5 de val_loss environ. </w:t>
+      </w:r>
+    </w:p>
+    <w:p>
+      <w:r>
+        <w:rPr>
+          <w:noProof/>
+        </w:rPr>
+        <w:drawing>
+          <wp:inline distT="0" distB="0" distL="0" distR="0" wp14:anchorId="27D782AD" wp14:editId="37840DE3">
+            <wp:extent cx="3783475" cy="2174497"/>
+            <wp:effectExtent l="0" t="0" r="7620" b="0"/>
+            <wp:docPr id="1893730422" name="Image 1"/>
+            <wp:cNvGraphicFramePr>
+              <a:graphicFrameLocks xmlns:a="http://schemas.openxmlformats.org/drawingml/2006/main" noChangeAspect="1"/>
+            </wp:cNvGraphicFramePr>
+            <a:graphic xmlns:a="http://schemas.openxmlformats.org/drawingml/2006/main">
+              <a:graphicData uri="http://schemas.openxmlformats.org/drawingml/2006/picture">
+                <pic:pic xmlns:pic="http://schemas.openxmlformats.org/drawingml/2006/picture">
+                  <pic:nvPicPr>
+                    <pic:cNvPr id="1893730422" name=""/>
+                    <pic:cNvPicPr/>
+                  </pic:nvPicPr>
+                  <pic:blipFill>
+                    <a:blip r:embed="rId8"/>
+                    <a:stretch>
+                      <a:fillRect/>
+                    </a:stretch>
+                  </pic:blipFill>
+                  <pic:spPr>
+                    <a:xfrm>
+                      <a:off x="0" y="0"/>
+                      <a:ext cx="3788494" cy="2177381"/>
+                    </a:xfrm>
+                    <a:prstGeom prst="rect">
+                      <a:avLst/>
+                    </a:prstGeom>
+                  </pic:spPr>
+                </pic:pic>
+              </a:graphicData>
+            </a:graphic>
+          </wp:inline>
+        </w:drawing>
+      </w:r>
+    </w:p>
+    <w:p>
+      <w:r>
+        <w:t>Train Loss : 0.0216</w:t>
+      </w:r>
+    </w:p>
+    <w:p>
+      <w:r>
+        <w:t>Train Acc  : 0.9899</w:t>
+      </w:r>
+      <w:r>
+        <w:br/>
+      </w:r>
+      <w:r>
+        <w:br/>
+        <w:t>On a de l’overfitting</w:t>
+      </w:r>
+      <w:r>
+        <w:t xml:space="preserve"> évident</w:t>
+      </w:r>
+      <w:r>
+        <w:t xml:space="preserve">. </w:t>
+      </w:r>
+      <w:r>
+        <w:t>Il faut passer par de l</w:t>
+      </w:r>
+      <w:r>
+        <w:t xml:space="preserve">’augmentation de données. </w:t>
+      </w:r>
+    </w:p>
+    <w:p>
+      <w:pPr>
+        <w:pStyle w:val="Titre3"/>
+      </w:pPr>
+      <w:r>
+        <w:t>Troisième modèle : on ajoute l’augmentation de données</w:t>
+      </w:r>
+      <w:r>
+        <w:t>, dropout = 0.2</w:t>
+      </w:r>
+    </w:p>
+    <w:p>
+      <w:r>
+        <w:t>Démarrage de l'entraînement...</w:t>
+      </w:r>
+    </w:p>
+    <w:p>
+      <w:r>
+        <w:t>Epoch 1/10 | Val Loss: 1.3830 | Val Acc: 0.2711</w:t>
+      </w:r>
+    </w:p>
+    <w:p>
+      <w:r>
+        <w:t>Train Loss: 0.4461</w:t>
+      </w:r>
+    </w:p>
+    <w:p>
+      <w:r>
+        <w:t>Nouveau meilleur modèle sauvegardé !</w:t>
+      </w:r>
+    </w:p>
+    <w:p>
+      <w:pPr>
+        <w:rPr>
+          <w:lang w:val="en-GB"/>
+        </w:rPr>
+      </w:pPr>
+      <w:r>
+        <w:rPr>
+          <w:lang w:val="en-GB"/>
+        </w:rPr>
+        <w:t>Epoch 2/10 | Val Loss: 0.8789 | Val Acc: 0.4809</w:t>
+      </w:r>
+    </w:p>
+    <w:p>
+      <w:r>
+        <w:t>Train Loss: 0.1168</w:t>
+      </w:r>
+    </w:p>
+    <w:p>
+      <w:r>
+        <w:t>Nouveau meilleur modèle sauvegardé !</w:t>
+      </w:r>
+    </w:p>
+    <w:p>
+      <w:pPr>
+        <w:rPr>
+          <w:lang w:val="en-GB"/>
+        </w:rPr>
+      </w:pPr>
+      <w:r>
+        <w:rPr>
+          <w:lang w:val="en-GB"/>
+        </w:rPr>
+        <w:t>Epoch 3/10 | Val Loss: 0.7160 | Val Acc: 0.6122</w:t>
+      </w:r>
+    </w:p>
+    <w:p>
+      <w:r>
+        <w:t>Train Loss: 0.0659</w:t>
+      </w:r>
+    </w:p>
+    <w:p>
+      <w:r>
+        <w:lastRenderedPageBreak/>
+        <w:t>Nouveau meilleur modèle sauvegardé !</w:t>
+      </w:r>
+    </w:p>
+    <w:p>
+      <w:pPr>
+        <w:rPr>
+          <w:lang w:val="en-GB"/>
+        </w:rPr>
+      </w:pPr>
+      <w:r>
+        <w:rPr>
+          <w:lang w:val="en-GB"/>
+        </w:rPr>
+        <w:t>Epoch 4/10 | Val Loss: 0.5639 | Val Acc: 0.7275</w:t>
+      </w:r>
+    </w:p>
+    <w:p>
+      <w:r>
+        <w:t>Train Loss: 0.0496</w:t>
+      </w:r>
+    </w:p>
+    <w:p>
+      <w:r>
+        <w:t>Nouveau meilleur modèle sauvegardé !</w:t>
+      </w:r>
+    </w:p>
+    <w:p>
+      <w:pPr>
+        <w:rPr>
+          <w:lang w:val="en-GB"/>
+        </w:rPr>
+      </w:pPr>
+      <w:r>
+        <w:rPr>
+          <w:lang w:val="en-GB"/>
+        </w:rPr>
+        <w:t>Epoch 5/10 | Val Loss: 0.5193 | Val Acc: 0.7564</w:t>
+      </w:r>
+    </w:p>
+    <w:p>
+      <w:r>
+        <w:t>Train Loss: 0.0551</w:t>
+      </w:r>
+    </w:p>
+    <w:p>
+      <w:r>
+        <w:t>Nouveau meilleur modèle sauvegardé !</w:t>
+      </w:r>
+    </w:p>
+    <w:p>
+      <w:pPr>
+        <w:rPr>
+          <w:lang w:val="en-GB"/>
+        </w:rPr>
+      </w:pPr>
+      <w:r>
+        <w:rPr>
+          <w:lang w:val="en-GB"/>
+        </w:rPr>
+        <w:t>Epoch 6/10 | Val Loss: 0.5070 | Val Acc: 0.7758</w:t>
+      </w:r>
+    </w:p>
+    <w:p>
+      <w:r>
+        <w:t>Train Loss: 0.0304</w:t>
+      </w:r>
+    </w:p>
+    <w:p>
+      <w:r>
+        <w:t>Nouveau meilleur modèle sauvegardé !</w:t>
+      </w:r>
+    </w:p>
+    <w:p>
+      <w:pPr>
+        <w:rPr>
+          <w:lang w:val="en-GB"/>
+        </w:rPr>
+      </w:pPr>
+      <w:r>
+        <w:rPr>
+          <w:lang w:val="en-GB"/>
+        </w:rPr>
+        <w:t>Epoch 7/10 | Val Loss: 0.4873 | Val Acc: 0.8016</w:t>
+      </w:r>
+    </w:p>
+    <w:p>
+      <w:r>
+        <w:t>Train Loss: 0.0246</w:t>
+      </w:r>
+    </w:p>
+    <w:p>
+      <w:r>
+        <w:t>Nouveau meilleur modèle sauvegardé !</w:t>
+      </w:r>
+    </w:p>
+    <w:p>
+      <w:pPr>
+        <w:rPr>
+          <w:lang w:val="en-GB"/>
+        </w:rPr>
+      </w:pPr>
+      <w:r>
+        <w:rPr>
+          <w:lang w:val="en-GB"/>
+        </w:rPr>
+        <w:t>Epoch 8/10 | Val Loss: 0.5336 | Val Acc: 0.8113</w:t>
+      </w:r>
+    </w:p>
+    <w:p>
+      <w:pPr>
+        <w:rPr>
+          <w:lang w:val="en-GB"/>
+        </w:rPr>
+      </w:pPr>
+      <w:r>
+        <w:rPr>
+          <w:lang w:val="en-GB"/>
+        </w:rPr>
+        <w:t>Train Loss: 0.0200</w:t>
+      </w:r>
+    </w:p>
+    <w:p>
+      <w:pPr>
+        <w:rPr>
+          <w:lang w:val="en-GB"/>
+        </w:rPr>
+      </w:pPr>
+      <w:r>
+        <w:rPr>
+          <w:lang w:val="en-GB"/>
+        </w:rPr>
+        <w:t>Epoch 9/10 | Val Loss: 0.5535 | Val Acc: 0.7799</w:t>
+      </w:r>
+    </w:p>
+    <w:p>
+      <w:pPr>
+        <w:rPr>
+          <w:lang w:val="en-GB"/>
+        </w:rPr>
+      </w:pPr>
+      <w:r>
+        <w:rPr>
+          <w:lang w:val="en-GB"/>
+        </w:rPr>
+        <w:t>Train Loss: 0.0284</w:t>
+      </w:r>
+    </w:p>
+    <w:p>
+      <w:pPr>
+        <w:rPr>
+          <w:lang w:val="en-GB"/>
+        </w:rPr>
+      </w:pPr>
+      <w:r>
+        <w:rPr>
+          <w:lang w:val="en-GB"/>
+        </w:rPr>
+        <w:t>Epoch 10/10 | Val Loss: 0.4547 | Val Acc: 0.8362</w:t>
+      </w:r>
+    </w:p>
+    <w:p>
+      <w:r>
+        <w:t>Train Loss: 0.0216</w:t>
+      </w:r>
+    </w:p>
+    <w:p>
+      <w:r>
+        <w:t>Nouveau meilleur modèle sauvegardé !</w:t>
+      </w:r>
+    </w:p>
+    <w:p>
+      <w:r>
+        <w:t>Un peu d’overfitting, dropout à 0.2.</w:t>
+      </w:r>
+    </w:p>
+    <w:p>
+      <w:r>
+        <w:t>On va augmenter le dropout à 0.5</w:t>
+      </w:r>
+    </w:p>
+    <w:p>
+      <w:pPr>
+        <w:pStyle w:val="Titre3"/>
+      </w:pPr>
+      <w:r>
+        <w:t>Quatrième modèle : dropout à 0.5</w:t>
+      </w:r>
+    </w:p>
+    <w:p>
+      <w:r>
+        <w:t>Démarrage de l'entraînement...</w:t>
+      </w:r>
+    </w:p>
+    <w:p>
+      <w:pPr>
+        <w:rPr>
+          <w:lang w:val="en-GB"/>
+        </w:rPr>
+      </w:pPr>
+      <w:r>
+        <w:rPr>
+          <w:lang w:val="en-GB"/>
+        </w:rPr>
+        <w:t>Epoch 1/10 | Val Loss: 1.4365 | Val Acc: 0.2557</w:t>
+      </w:r>
+    </w:p>
+    <w:p>
+      <w:r>
+        <w:t>Train Loss: 0.4736</w:t>
+      </w:r>
+    </w:p>
+    <w:p>
+      <w:r>
+        <w:t>Nouveau meilleur modèle sauvegardé !</w:t>
+      </w:r>
+    </w:p>
+    <w:p>
+      <w:pPr>
+        <w:rPr>
+          <w:lang w:val="en-GB"/>
+        </w:rPr>
+      </w:pPr>
+      <w:r>
+        <w:rPr>
+          <w:lang w:val="en-GB"/>
+        </w:rPr>
+        <w:t>Epoch 2/10 | Val Loss: 0.9307 | Val Acc: 0.4585</w:t>
+      </w:r>
+    </w:p>
+    <w:p>
+      <w:r>
+        <w:lastRenderedPageBreak/>
+        <w:t>Train Loss: 0.1270</w:t>
+      </w:r>
+    </w:p>
+    <w:p>
+      <w:r>
+        <w:t>Nouveau meilleur modèle sauvegardé !</w:t>
+      </w:r>
+    </w:p>
+    <w:p>
+      <w:pPr>
+        <w:rPr>
+          <w:lang w:val="en-GB"/>
+        </w:rPr>
+      </w:pPr>
+      <w:r>
+        <w:rPr>
+          <w:lang w:val="en-GB"/>
+        </w:rPr>
+        <w:t>Epoch 3/10 | Val Loss: 0.7342 | Val Acc: 0.5880</w:t>
+      </w:r>
+    </w:p>
+    <w:p>
+      <w:r>
+        <w:t>Train Loss: 0.0720</w:t>
+      </w:r>
+    </w:p>
+    <w:p>
+      <w:r>
+        <w:t>Nouveau meilleur modèle sauvegardé !</w:t>
+      </w:r>
+    </w:p>
+    <w:p>
+      <w:pPr>
+        <w:rPr>
+          <w:lang w:val="en-GB"/>
+        </w:rPr>
+      </w:pPr>
+      <w:r>
+        <w:rPr>
+          <w:lang w:val="en-GB"/>
+        </w:rPr>
+        <w:t>Epoch 4/10 | Val Loss: 0.5960 | Val Acc: 0.6928</w:t>
+      </w:r>
+    </w:p>
+    <w:p>
+      <w:r>
+        <w:t>Train Loss: 0.0547</w:t>
+      </w:r>
+    </w:p>
+    <w:p>
+      <w:r>
+        <w:t>Nouveau meilleur modèle sauvegardé !</w:t>
+      </w:r>
+    </w:p>
+    <w:p>
+      <w:pPr>
+        <w:rPr>
+          <w:lang w:val="en-GB"/>
+        </w:rPr>
+      </w:pPr>
+      <w:r>
+        <w:rPr>
+          <w:lang w:val="en-GB"/>
+        </w:rPr>
+        <w:t>Epoch 5/10 | Val Loss: 0.5867 | Val Acc: 0.7161</w:t>
+      </w:r>
+    </w:p>
+    <w:p>
+      <w:r>
+        <w:t>Train Loss: 0.0387</w:t>
+      </w:r>
+    </w:p>
+    <w:p>
+      <w:r>
+        <w:t>Nouveau meilleur modèle sauvegardé !</w:t>
+      </w:r>
+    </w:p>
+    <w:p>
+      <w:pPr>
+        <w:rPr>
+          <w:lang w:val="en-GB"/>
+        </w:rPr>
+      </w:pPr>
+      <w:r>
+        <w:rPr>
+          <w:lang w:val="en-GB"/>
+        </w:rPr>
+        <w:t>Epoch 6/10 | Val Loss: 0.4881 | Val Acc: 0.7815</w:t>
+      </w:r>
+    </w:p>
+    <w:p>
+      <w:r>
+        <w:t>Train Loss: 0.0367</w:t>
+      </w:r>
+    </w:p>
+    <w:p>
+      <w:r>
+        <w:t>Nouveau meilleur modèle sauvegardé !</w:t>
+      </w:r>
+    </w:p>
+    <w:p>
+      <w:pPr>
+        <w:rPr>
+          <w:lang w:val="en-GB"/>
+        </w:rPr>
+      </w:pPr>
+      <w:r>
+        <w:rPr>
+          <w:lang w:val="en-GB"/>
+        </w:rPr>
+        <w:t>Epoch 7/10 | Val Loss: 0.5059 | Val Acc: 0.7903</w:t>
+      </w:r>
+    </w:p>
+    <w:p>
+      <w:pPr>
+        <w:rPr>
+          <w:lang w:val="en-GB"/>
+        </w:rPr>
+      </w:pPr>
+      <w:r>
+        <w:rPr>
+          <w:lang w:val="en-GB"/>
+        </w:rPr>
+        <w:t>Train Loss: 0.0256</w:t>
+      </w:r>
+    </w:p>
+    <w:p>
+      <w:pPr>
+        <w:rPr>
+          <w:lang w:val="en-GB"/>
+        </w:rPr>
+      </w:pPr>
+      <w:r>
+        <w:rPr>
+          <w:lang w:val="en-GB"/>
+        </w:rPr>
+        <w:t>Epoch 8/10 | Val Loss: 0.4635 | Val Acc: 0.8099</w:t>
+      </w:r>
+    </w:p>
+    <w:p>
+      <w:r>
+        <w:t>Train Loss: 0.0265</w:t>
+      </w:r>
+    </w:p>
+    <w:p>
+      <w:r>
+        <w:t>Nouveau meilleur modèle sauvegardé !</w:t>
+      </w:r>
+    </w:p>
+    <w:p>
+      <w:pPr>
+        <w:rPr>
+          <w:lang w:val="en-GB"/>
+        </w:rPr>
+      </w:pPr>
+      <w:r>
+        <w:rPr>
+          <w:lang w:val="en-GB"/>
+        </w:rPr>
+        <w:t>Epoch 9/10 | Val Loss: 0.5178 | Val Acc: 0.8103</w:t>
+      </w:r>
+    </w:p>
+    <w:p>
+      <w:pPr>
+        <w:rPr>
+          <w:lang w:val="en-GB"/>
+        </w:rPr>
+      </w:pPr>
+      <w:r>
+        <w:rPr>
+          <w:lang w:val="en-GB"/>
+        </w:rPr>
+        <w:t>Train Loss: 0.0209</w:t>
+      </w:r>
+    </w:p>
+    <w:p>
+      <w:pPr>
+        <w:rPr>
+          <w:lang w:val="en-GB"/>
+        </w:rPr>
+      </w:pPr>
+      <w:r>
+        <w:rPr>
+          <w:lang w:val="en-GB"/>
+        </w:rPr>
+        <w:t>Epoch 10/10 | Val Loss: 0.4595 | Val Acc: 0.8381</w:t>
+      </w:r>
+    </w:p>
+    <w:p>
+      <w:r>
+        <w:t>Train Loss: 0.0205</w:t>
+      </w:r>
+    </w:p>
+    <w:p>
+      <w:r>
+        <w:t>Nouveau meilleur modèle sauvegardé !</w:t>
+      </w:r>
+    </w:p>
+    <w:p>
+      <w:r>
+        <w:rPr>
+          <w:noProof/>
+        </w:rPr>
+        <w:lastRenderedPageBreak/>
+        <w:drawing>
+          <wp:inline distT="0" distB="0" distL="0" distR="0" wp14:anchorId="7F2BA49E" wp14:editId="1788983A">
+            <wp:extent cx="5760720" cy="2222500"/>
+            <wp:effectExtent l="0" t="0" r="0" b="6350"/>
+            <wp:docPr id="1395504737" name="Image 1"/>
+            <wp:cNvGraphicFramePr>
+              <a:graphicFrameLocks xmlns:a="http://schemas.openxmlformats.org/drawingml/2006/main" noChangeAspect="1"/>
+            </wp:cNvGraphicFramePr>
+            <a:graphic xmlns:a="http://schemas.openxmlformats.org/drawingml/2006/main">
+              <a:graphicData uri="http://schemas.openxmlformats.org/drawingml/2006/picture">
+                <pic:pic xmlns:pic="http://schemas.openxmlformats.org/drawingml/2006/picture">
+                  <pic:nvPicPr>
+                    <pic:cNvPr id="1395504737" name=""/>
+                    <pic:cNvPicPr/>
+                  </pic:nvPicPr>
+                  <pic:blipFill>
+                    <a:blip r:embed="rId9"/>
+                    <a:stretch>
+                      <a:fillRect/>
+                    </a:stretch>
+                  </pic:blipFill>
+                  <pic:spPr>
+                    <a:xfrm>
+                      <a:off x="0" y="0"/>
+                      <a:ext cx="5760720" cy="2222500"/>
+                    </a:xfrm>
+                    <a:prstGeom prst="rect">
+                      <a:avLst/>
+                    </a:prstGeom>
+                  </pic:spPr>
+                </pic:pic>
+              </a:graphicData>
+            </a:graphic>
+          </wp:inline>
+        </w:drawing>
+      </w:r>
+    </w:p>
+    <w:p>
+      <w:r>
+        <w:t>Toujours de l’overfitting, plus modéré.</w:t>
+      </w:r>
+    </w:p>
+    <w:p>
+      <w:r>
+        <w:t>On ajoute un scheduler, avec ReduceLROnPlateau, qui réduit le learning rate si la validation ne s’améliore pas pendant  époques consécutives.</w:t>
+      </w:r>
+    </w:p>
+    <w:p>
+      <w:pPr>
+        <w:pStyle w:val="Titre2"/>
+      </w:pPr>
+      <w:r>
+        <w:t xml:space="preserve">Optimisation avec Optuna </w:t>
+      </w:r>
+    </w:p>
+    <w:p>
+      <w:r>
+        <w:drawing>
+          <wp:inline distT="0" distB="0" distL="0" distR="0" wp14:anchorId="19C39261" wp14:editId="5CE886E7">
+            <wp:extent cx="5760720" cy="689610"/>
+            <wp:effectExtent l="0" t="0" r="0" b="0"/>
+            <wp:docPr id="1329962655" name="Image 1"/>
+            <wp:cNvGraphicFramePr>
+              <a:graphicFrameLocks xmlns:a="http://schemas.openxmlformats.org/drawingml/2006/main" noChangeAspect="1"/>
+            </wp:cNvGraphicFramePr>
+            <a:graphic xmlns:a="http://schemas.openxmlformats.org/drawingml/2006/main">
+              <a:graphicData uri="http://schemas.openxmlformats.org/drawingml/2006/picture">
+                <pic:pic xmlns:pic="http://schemas.openxmlformats.org/drawingml/2006/picture">
+                  <pic:nvPicPr>
+                    <pic:cNvPr id="1329962655" name=""/>
+                    <pic:cNvPicPr/>
+                  </pic:nvPicPr>
+                  <pic:blipFill>
+                    <a:blip r:embed="rId10"/>
+                    <a:stretch>
+                      <a:fillRect/>
+                    </a:stretch>
+                  </pic:blipFill>
+                  <pic:spPr>
+                    <a:xfrm>
+                      <a:off x="0" y="0"/>
+                      <a:ext cx="5760720" cy="689610"/>
+                    </a:xfrm>
+                    <a:prstGeom prst="rect">
+                      <a:avLst/>
+                    </a:prstGeom>
+                  </pic:spPr>
+                </pic:pic>
+              </a:graphicData>
+            </a:graphic>
+          </wp:inline>
+        </w:drawing>
+      </w:r>
+    </w:p>
+    <w:p>
+      <w:r>
+        <w:rPr>
+          <w:lang w:val="en-GB"/>
+        </w:rPr>
+        <w:t xml:space="preserve">Trial 5 finished with value: 0.35482414653806976 and parameters: {'lr': 0.00025950393827819934, 'dropout': 0.5416202525218761, 'weight_decay': 4.751507773262611e-05, 'freeze_layer': 'layer4.0'}. </w:t>
+      </w:r>
+      <w:r>
+        <w:t>Best is trial 5 with value: 0.35482414653806976.</w:t>
+      </w:r>
+    </w:p>
+    <w:p/>
     <w:sectPr>
       <w:pgSz w:w="11906" w:h="16838"/>
       <w:pgMar w:top="1417" w:right="1417" w:bottom="1417" w:left="1417" w:header="708" w:footer="708" w:gutter="0"/>
@@ -542,6 +2470,155 @@
     </w:lvl>
   </w:abstractNum>
   <w:abstractNum w:abstractNumId="1" w15:restartNumberingAfterBreak="0">
+    <w:nsid w:val="738509BD"/>
+    <w:multiLevelType w:val="multilevel"/>
+    <w:tmpl w:val="96A0FFC6"/>
+    <w:lvl w:ilvl="0">
+      <w:start w:val="1"/>
+      <w:numFmt w:val="bullet"/>
+      <w:lvlText w:val=""/>
+      <w:lvlJc w:val="left"/>
+      <w:pPr>
+        <w:tabs>
+          <w:tab w:val="num" w:pos="720"/>
+        </w:tabs>
+        <w:ind w:left="720" w:hanging="360"/>
+      </w:pPr>
+      <w:rPr>
+        <w:rFonts w:ascii="Symbol" w:hAnsi="Symbol" w:hint="default"/>
+        <w:sz w:val="20"/>
+      </w:rPr>
+    </w:lvl>
+    <w:lvl w:ilvl="1" w:tentative="1">
+      <w:start w:val="1"/>
+      <w:numFmt w:val="bullet"/>
+      <w:lvlText w:val="o"/>
+      <w:lvlJc w:val="left"/>
+      <w:pPr>
+        <w:tabs>
+          <w:tab w:val="num" w:pos="1440"/>
+        </w:tabs>
+        <w:ind w:left="1440" w:hanging="360"/>
+      </w:pPr>
+      <w:rPr>
+        <w:rFonts w:ascii="Courier New" w:hAnsi="Courier New" w:hint="default"/>
+        <w:sz w:val="20"/>
+      </w:rPr>
+    </w:lvl>
+    <w:lvl w:ilvl="2" w:tentative="1">
+      <w:start w:val="1"/>
+      <w:numFmt w:val="bullet"/>
+      <w:lvlText w:val=""/>
+      <w:lvlJc w:val="left"/>
+      <w:pPr>
+        <w:tabs>
+          <w:tab w:val="num" w:pos="2160"/>
+        </w:tabs>
+        <w:ind w:left="2160" w:hanging="360"/>
+      </w:pPr>
+      <w:rPr>
+        <w:rFonts w:ascii="Wingdings" w:hAnsi="Wingdings" w:hint="default"/>
+        <w:sz w:val="20"/>
+      </w:rPr>
+    </w:lvl>
+    <w:lvl w:ilvl="3" w:tentative="1">
+      <w:start w:val="1"/>
+      <w:numFmt w:val="bullet"/>
+      <w:lvlText w:val=""/>
+      <w:lvlJc w:val="left"/>
+      <w:pPr>
+        <w:tabs>
+          <w:tab w:val="num" w:pos="2880"/>
+        </w:tabs>
+        <w:ind w:left="2880" w:hanging="360"/>
+      </w:pPr>
+      <w:rPr>
+        <w:rFonts w:ascii="Wingdings" w:hAnsi="Wingdings" w:hint="default"/>
+        <w:sz w:val="20"/>
+      </w:rPr>
+    </w:lvl>
+    <w:lvl w:ilvl="4" w:tentative="1">
+      <w:start w:val="1"/>
+      <w:numFmt w:val="bullet"/>
+      <w:lvlText w:val=""/>
+      <w:lvlJc w:val="left"/>
+      <w:pPr>
+        <w:tabs>
+          <w:tab w:val="num" w:pos="3600"/>
+        </w:tabs>
+        <w:ind w:left="3600" w:hanging="360"/>
+      </w:pPr>
+      <w:rPr>
+        <w:rFonts w:ascii="Wingdings" w:hAnsi="Wingdings" w:hint="default"/>
+        <w:sz w:val="20"/>
+      </w:rPr>
+    </w:lvl>
+    <w:lvl w:ilvl="5" w:tentative="1">
+      <w:start w:val="1"/>
+      <w:numFmt w:val="bullet"/>
+      <w:lvlText w:val=""/>
+      <w:lvlJc w:val="left"/>
+      <w:pPr>
+        <w:tabs>
+          <w:tab w:val="num" w:pos="4320"/>
+        </w:tabs>
+        <w:ind w:left="4320" w:hanging="360"/>
+      </w:pPr>
+      <w:rPr>
+        <w:rFonts w:ascii="Wingdings" w:hAnsi="Wingdings" w:hint="default"/>
+        <w:sz w:val="20"/>
+      </w:rPr>
+    </w:lvl>
+    <w:lvl w:ilvl="6" w:tentative="1">
+      <w:start w:val="1"/>
+      <w:numFmt w:val="bullet"/>
+      <w:lvlText w:val=""/>
+      <w:lvlJc w:val="left"/>
+      <w:pPr>
+        <w:tabs>
+          <w:tab w:val="num" w:pos="5040"/>
+        </w:tabs>
+        <w:ind w:left="5040" w:hanging="360"/>
+      </w:pPr>
+      <w:rPr>
+        <w:rFonts w:ascii="Wingdings" w:hAnsi="Wingdings" w:hint="default"/>
+        <w:sz w:val="20"/>
+      </w:rPr>
+    </w:lvl>
+    <w:lvl w:ilvl="7" w:tentative="1">
+      <w:start w:val="1"/>
+      <w:numFmt w:val="bullet"/>
+      <w:lvlText w:val=""/>
+      <w:lvlJc w:val="left"/>
+      <w:pPr>
+        <w:tabs>
+          <w:tab w:val="num" w:pos="5760"/>
+        </w:tabs>
+        <w:ind w:left="5760" w:hanging="360"/>
+      </w:pPr>
+      <w:rPr>
+        <w:rFonts w:ascii="Wingdings" w:hAnsi="Wingdings" w:hint="default"/>
+        <w:sz w:val="20"/>
+      </w:rPr>
+    </w:lvl>
+    <w:lvl w:ilvl="8" w:tentative="1">
+      <w:start w:val="1"/>
+      <w:numFmt w:val="bullet"/>
+      <w:lvlText w:val=""/>
+      <w:lvlJc w:val="left"/>
+      <w:pPr>
+        <w:tabs>
+          <w:tab w:val="num" w:pos="6480"/>
+        </w:tabs>
+        <w:ind w:left="6480" w:hanging="360"/>
+      </w:pPr>
+      <w:rPr>
+        <w:rFonts w:ascii="Wingdings" w:hAnsi="Wingdings" w:hint="default"/>
+        <w:sz w:val="20"/>
+      </w:rPr>
+    </w:lvl>
+  </w:abstractNum>
+  <w:abstractNum w:abstractNumId="2" w15:restartNumberingAfterBreak="0">
     <w:nsid w:val="7A6536B8"/>
     <w:multiLevelType w:val="hybridMultilevel"/>
     <w:tmpl w:val="DD3A823E"/>
@@ -658,6 +2735,9 @@
     <w:abstractNumId w:val="0"/>
   </w:num>
   <w:num w:numId="2" w16cid:durableId="31270853">
+    <w:abstractNumId w:val="2"/>
+  </w:num>
+  <w:num w:numId="3" w16cid:durableId="1894534564">
     <w:abstractNumId w:val="1"/>
   </w:num>
 </w:numbering>
@@ -1091,7 +3171,6 @@
     <w:next w:val="Normal"/>
     <w:link w:val="Titre2Car"/>
     <w:uiPriority w:val="9"/>
-    <w:semiHidden/>
     <w:unhideWhenUsed/>
     <w:qFormat/>
     <w:rsid w:val="00D03DF5"/>
@@ -1114,7 +3193,6 @@
     <w:next w:val="Normal"/>
     <w:link w:val="Titre3Car"/>
     <w:uiPriority w:val="9"/>
-    <w:semiHidden/>
     <w:unhideWhenUsed/>
     <w:qFormat/>
     <w:rsid w:val="00D03DF5"/>
@@ -1266,7 +3344,6 @@
   <w:style w:type="character" w:default="1" w:styleId="Policepardfaut">
     <w:name w:val="Default Paragraph Font"/>
     <w:uiPriority w:val="1"/>
-    <w:semiHidden/>
     <w:unhideWhenUsed/>
   </w:style>
   <w:style w:type="table" w:default="1" w:styleId="TableauNormal">
@@ -1308,7 +3385,6 @@
     <w:basedOn w:val="Policepardfaut"/>
     <w:link w:val="Titre2"/>
     <w:uiPriority w:val="9"/>
-    <w:semiHidden/>
     <w:rsid w:val="00D03DF5"/>
     <w:rPr>
       <w:rFonts w:asciiTheme="majorHAnsi" w:eastAsiaTheme="majorEastAsia" w:hAnsiTheme="majorHAnsi" w:cstheme="majorBidi"/>
@@ -1322,7 +3398,6 @@
     <w:basedOn w:val="Policepardfaut"/>
     <w:link w:val="Titre3"/>
     <w:uiPriority w:val="9"/>
-    <w:semiHidden/>
     <w:rsid w:val="00D03DF5"/>
     <w:rPr>
       <w:rFonts w:eastAsiaTheme="majorEastAsia" w:cstheme="majorBidi"/>

</xml_diff>